<commit_message>
Edited the Form a bit.( 😁)
</commit_message>
<xml_diff>
--- a/ЗВІТ.docx
+++ b/ЗВІТ.docx
@@ -275,18 +275,7 @@
           <w:sz w:val="28"/>
           <w:szCs w:val="28"/>
         </w:rPr>
-        <w:t>Б</w:t>
-      </w:r>
-      <w:r>
-        <w:rPr>
-          <w:b/>
-          <w:bCs/>
-          <w:noProof/>
-          <w:color w:val="252424"/>
-          <w:sz w:val="28"/>
-          <w:szCs w:val="28"/>
-        </w:rPr>
-        <w:t>інування даних лінгвістичної статистики</w:t>
+        <w:t>Бінування даних лінгвістичної статистики</w:t>
       </w:r>
       <w:r>
         <w:rPr>
@@ -685,19 +674,41 @@
         <w:ind w:firstLine="426"/>
         <w:jc w:val="both"/>
         <w:rPr>
-          <w:noProof/>
-          <w:sz w:val="28"/>
-          <w:szCs w:val="28"/>
-        </w:rPr>
-      </w:pPr>
-      <w:r>
-        <w:rPr>
           <w:b/>
           <w:noProof/>
           <w:sz w:val="28"/>
           <w:szCs w:val="28"/>
         </w:rPr>
+      </w:pPr>
+      <w:r>
+        <w:rPr>
+          <w:b/>
+          <w:noProof/>
+          <w:sz w:val="28"/>
+          <w:szCs w:val="28"/>
+        </w:rPr>
         <w:lastRenderedPageBreak/>
+        <w:t>Зміст</w:t>
+      </w:r>
+    </w:p>
+    <w:p>
+      <w:pPr>
+        <w:spacing w:line="360" w:lineRule="auto"/>
+        <w:ind w:firstLine="426"/>
+        <w:jc w:val="both"/>
+        <w:rPr>
+          <w:noProof/>
+          <w:sz w:val="28"/>
+          <w:szCs w:val="28"/>
+        </w:rPr>
+      </w:pPr>
+      <w:r>
+        <w:rPr>
+          <w:b/>
+          <w:noProof/>
+          <w:sz w:val="28"/>
+          <w:szCs w:val="28"/>
+        </w:rPr>
         <w:t xml:space="preserve">Мета роботи : </w:t>
       </w:r>
       <w:r>
@@ -712,31 +723,224 @@
     <w:p>
       <w:pPr>
         <w:spacing w:line="360" w:lineRule="auto"/>
+        <w:jc w:val="center"/>
         <w:rPr>
           <w:b/>
           <w:bCs/>
           <w:noProof/>
           <w:sz w:val="28"/>
           <w:szCs w:val="28"/>
-          <w:lang w:val="ru-RU"/>
-        </w:rPr>
-      </w:pPr>
-      <w:r>
-        <w:rPr>
-          <w:noProof/>
-          <w:sz w:val="28"/>
-          <w:szCs w:val="28"/>
-        </w:rPr>
-        <w:t>Хід роботи(інструкція):</w:t>
-      </w:r>
-      <w:r>
-        <w:rPr>
-          <w:noProof/>
-          <w:sz w:val="28"/>
-          <w:szCs w:val="28"/>
-        </w:rPr>
-        <w:br/>
-        <w:t xml:space="preserve">Для </w:t>
+        </w:rPr>
+      </w:pPr>
+      <w:r>
+        <w:rPr>
+          <w:b/>
+          <w:bCs/>
+          <w:noProof/>
+          <w:sz w:val="28"/>
+          <w:szCs w:val="28"/>
+        </w:rPr>
+        <w:t>Хід роботи(інструкція)</w:t>
+      </w:r>
+    </w:p>
+    <w:p>
+      <w:pPr>
+        <w:spacing w:line="360" w:lineRule="auto"/>
+        <w:rPr>
+          <w:noProof/>
+          <w:sz w:val="28"/>
+          <w:szCs w:val="28"/>
+        </w:rPr>
+      </w:pPr>
+      <w:r>
+        <w:rPr>
+          <w:noProof/>
+          <w:sz w:val="28"/>
+          <w:szCs w:val="28"/>
+        </w:rPr>
+        <w:t>Основні елементи:</w:t>
+      </w:r>
+    </w:p>
+    <w:p>
+      <w:pPr>
+        <w:spacing w:line="360" w:lineRule="auto"/>
+        <w:rPr>
+          <w:noProof/>
+          <w:sz w:val="28"/>
+          <w:szCs w:val="28"/>
+        </w:rPr>
+      </w:pPr>
+      <w:r>
+        <w:rPr>
+          <w:noProof/>
+          <w:sz w:val="28"/>
+          <w:szCs w:val="28"/>
+        </w:rPr>
+        <w:t>Відкрити папку з текстами</w:t>
+      </w:r>
+    </w:p>
+    <w:p>
+      <w:pPr>
+        <w:spacing w:line="360" w:lineRule="auto"/>
+        <w:rPr>
+          <w:noProof/>
+          <w:sz w:val="28"/>
+          <w:szCs w:val="28"/>
+        </w:rPr>
+      </w:pPr>
+      <w:r>
+        <w:rPr>
+          <w:noProof/>
+          <w:sz w:val="28"/>
+          <w:szCs w:val="28"/>
+        </w:rPr>
+        <w:t>Порахувати слова в текстах</w:t>
+      </w:r>
+    </w:p>
+    <w:p>
+      <w:pPr>
+        <w:spacing w:line="360" w:lineRule="auto"/>
+        <w:rPr>
+          <w:noProof/>
+          <w:sz w:val="28"/>
+          <w:szCs w:val="28"/>
+        </w:rPr>
+      </w:pPr>
+      <w:r>
+        <w:rPr>
+          <w:noProof/>
+          <w:sz w:val="28"/>
+          <w:szCs w:val="28"/>
+        </w:rPr>
+        <w:t>Порахувати символи в текстах</w:t>
+      </w:r>
+    </w:p>
+    <w:p>
+      <w:pPr>
+        <w:spacing w:line="360" w:lineRule="auto"/>
+        <w:rPr>
+          <w:noProof/>
+          <w:sz w:val="28"/>
+          <w:szCs w:val="28"/>
+        </w:rPr>
+      </w:pPr>
+      <w:r>
+        <w:rPr>
+          <w:noProof/>
+          <w:sz w:val="28"/>
+          <w:szCs w:val="28"/>
+        </w:rPr>
+        <w:t>Ігнорувати регістр</w:t>
+      </w:r>
+    </w:p>
+    <w:p>
+      <w:pPr>
+        <w:spacing w:line="360" w:lineRule="auto"/>
+        <w:rPr>
+          <w:noProof/>
+          <w:sz w:val="28"/>
+          <w:szCs w:val="28"/>
+        </w:rPr>
+      </w:pPr>
+      <w:r>
+        <w:rPr>
+          <w:noProof/>
+          <w:sz w:val="28"/>
+          <w:szCs w:val="28"/>
+        </w:rPr>
+        <w:t>З пропусками</w:t>
+      </w:r>
+    </w:p>
+    <w:p>
+      <w:pPr>
+        <w:spacing w:line="360" w:lineRule="auto"/>
+        <w:rPr>
+          <w:noProof/>
+          <w:sz w:val="28"/>
+          <w:szCs w:val="28"/>
+        </w:rPr>
+      </w:pPr>
+      <w:r>
+        <w:rPr>
+          <w:noProof/>
+          <w:sz w:val="28"/>
+          <w:szCs w:val="28"/>
+        </w:rPr>
+        <w:t>Відкрити словник</w:t>
+      </w:r>
+    </w:p>
+    <w:p>
+      <w:pPr>
+        <w:spacing w:line="360" w:lineRule="auto"/>
+        <w:rPr>
+          <w:noProof/>
+          <w:sz w:val="28"/>
+          <w:szCs w:val="28"/>
+        </w:rPr>
+      </w:pPr>
+      <w:r>
+        <w:rPr>
+          <w:noProof/>
+          <w:sz w:val="28"/>
+          <w:szCs w:val="28"/>
+        </w:rPr>
+        <w:t>Відкрити файл бінування</w:t>
+      </w:r>
+    </w:p>
+    <w:p>
+      <w:pPr>
+        <w:spacing w:line="360" w:lineRule="auto"/>
+        <w:rPr>
+          <w:noProof/>
+          <w:sz w:val="28"/>
+          <w:szCs w:val="28"/>
+        </w:rPr>
+      </w:pPr>
+      <w:r>
+        <w:rPr>
+          <w:noProof/>
+          <w:sz w:val="28"/>
+          <w:szCs w:val="28"/>
+        </w:rPr>
+        <w:t>Зберегти словник у декількох форматах</w:t>
+      </w:r>
+    </w:p>
+    <w:p>
+      <w:pPr>
+        <w:spacing w:line="360" w:lineRule="auto"/>
+        <w:rPr>
+          <w:noProof/>
+          <w:sz w:val="28"/>
+          <w:szCs w:val="28"/>
+        </w:rPr>
+      </w:pPr>
+      <w:r>
+        <w:rPr>
+          <w:noProof/>
+          <w:sz w:val="28"/>
+          <w:szCs w:val="28"/>
+        </w:rPr>
+        <w:t>Зберегти файл бінування у декількох форматах</w:t>
+      </w:r>
+    </w:p>
+    <w:p>
+      <w:pPr>
+        <w:spacing w:line="360" w:lineRule="auto"/>
+        <w:rPr>
+          <w:b/>
+          <w:bCs/>
+          <w:noProof/>
+          <w:sz w:val="28"/>
+          <w:szCs w:val="28"/>
+        </w:rPr>
+      </w:pPr>
+      <w:r>
+        <w:rPr>
+          <w:noProof/>
+          <w:sz w:val="28"/>
+          <w:szCs w:val="28"/>
+        </w:rPr>
+        <w:t>Зберегти графік</w:t>
       </w:r>
     </w:p>
     <w:sectPr>

</xml_diff>

<commit_message>
Added all docs file to git, bugs with sor fixed.
</commit_message>
<xml_diff>
--- a/ЗВІТ.docx
+++ b/ЗВІТ.docx
@@ -661,12 +661,951 @@
           <w:szCs w:val="28"/>
         </w:rPr>
         <w:sectPr>
+          <w:headerReference w:type="default" r:id="rId8"/>
           <w:type w:val="continuous"/>
           <w:pgSz w:w="11920" w:h="16840"/>
           <w:pgMar w:top="1380" w:right="1417" w:bottom="280" w:left="1417" w:header="708" w:footer="708" w:gutter="0"/>
           <w:cols w:space="720"/>
+          <w:titlePg/>
+          <w:docGrid w:linePitch="299"/>
         </w:sectPr>
       </w:pPr>
+    </w:p>
+    <w:p>
+      <w:pPr>
+        <w:pStyle w:val="a7"/>
+        <w:rPr>
+          <w:noProof/>
+        </w:rPr>
+      </w:pPr>
+      <w:bookmarkStart w:id="0" w:name="_Toc203487708"/>
+      <w:r>
+        <w:rPr>
+          <w:noProof/>
+        </w:rPr>
+        <w:lastRenderedPageBreak/>
+        <w:t>Зміст</w:t>
+      </w:r>
+      <w:bookmarkEnd w:id="0"/>
+    </w:p>
+    <w:p>
+      <w:pPr>
+        <w:pStyle w:val="10"/>
+        <w:tabs>
+          <w:tab w:val="right" w:leader="dot" w:pos="9076"/>
+        </w:tabs>
+        <w:rPr>
+          <w:rFonts w:asciiTheme="minorHAnsi" w:eastAsiaTheme="minorEastAsia" w:hAnsiTheme="minorHAnsi" w:cstheme="minorBidi"/>
+          <w:noProof/>
+          <w:kern w:val="2"/>
+          <w:sz w:val="24"/>
+          <w:szCs w:val="24"/>
+          <w:lang w:val="ru-RU" w:eastAsia="ru-RU"/>
+          <w14:ligatures w14:val="standardContextual"/>
+        </w:rPr>
+      </w:pPr>
+      <w:r>
+        <w:fldChar w:fldCharType="begin"/>
+      </w:r>
+      <w:r>
+        <w:instrText xml:space="preserve"> TOC \h \z \t "Заголовок 1;2;Заголовок;1" </w:instrText>
+      </w:r>
+      <w:r>
+        <w:fldChar w:fldCharType="separate"/>
+      </w:r>
+      <w:hyperlink w:anchor="_Toc203487708" w:history="1">
+        <w:r>
+          <w:rPr>
+            <w:rStyle w:val="a9"/>
+            <w:rFonts w:eastAsiaTheme="majorEastAsia"/>
+            <w:noProof/>
+          </w:rPr>
+          <w:t>Зміст</w:t>
+        </w:r>
+        <w:r>
+          <w:rPr>
+            <w:noProof/>
+            <w:webHidden/>
+          </w:rPr>
+          <w:tab/>
+        </w:r>
+        <w:r>
+          <w:rPr>
+            <w:noProof/>
+            <w:webHidden/>
+          </w:rPr>
+          <w:fldChar w:fldCharType="begin"/>
+        </w:r>
+        <w:r>
+          <w:rPr>
+            <w:noProof/>
+            <w:webHidden/>
+          </w:rPr>
+          <w:instrText xml:space="preserve"> PAGEREF _Toc203487708 \h </w:instrText>
+        </w:r>
+        <w:r>
+          <w:rPr>
+            <w:noProof/>
+            <w:webHidden/>
+          </w:rPr>
+        </w:r>
+        <w:r>
+          <w:rPr>
+            <w:noProof/>
+            <w:webHidden/>
+          </w:rPr>
+          <w:fldChar w:fldCharType="separate"/>
+        </w:r>
+        <w:r>
+          <w:rPr>
+            <w:noProof/>
+            <w:webHidden/>
+          </w:rPr>
+          <w:t>2</w:t>
+        </w:r>
+        <w:r>
+          <w:rPr>
+            <w:noProof/>
+            <w:webHidden/>
+          </w:rPr>
+          <w:fldChar w:fldCharType="end"/>
+        </w:r>
+      </w:hyperlink>
+    </w:p>
+    <w:p>
+      <w:pPr>
+        <w:pStyle w:val="10"/>
+        <w:tabs>
+          <w:tab w:val="right" w:leader="dot" w:pos="9076"/>
+        </w:tabs>
+        <w:rPr>
+          <w:rFonts w:asciiTheme="minorHAnsi" w:eastAsiaTheme="minorEastAsia" w:hAnsiTheme="minorHAnsi" w:cstheme="minorBidi"/>
+          <w:noProof/>
+          <w:kern w:val="2"/>
+          <w:sz w:val="24"/>
+          <w:szCs w:val="24"/>
+          <w:lang w:val="ru-RU" w:eastAsia="ru-RU"/>
+          <w14:ligatures w14:val="standardContextual"/>
+        </w:rPr>
+      </w:pPr>
+      <w:hyperlink w:anchor="_Toc203487709" w:history="1">
+        <w:r>
+          <w:rPr>
+            <w:rStyle w:val="a9"/>
+            <w:rFonts w:eastAsiaTheme="majorEastAsia"/>
+            <w:noProof/>
+          </w:rPr>
+          <w:t>Хід роботи(інструкція)</w:t>
+        </w:r>
+        <w:r>
+          <w:rPr>
+            <w:noProof/>
+            <w:webHidden/>
+          </w:rPr>
+          <w:tab/>
+        </w:r>
+        <w:r>
+          <w:rPr>
+            <w:noProof/>
+            <w:webHidden/>
+          </w:rPr>
+          <w:fldChar w:fldCharType="begin"/>
+        </w:r>
+        <w:r>
+          <w:rPr>
+            <w:noProof/>
+            <w:webHidden/>
+          </w:rPr>
+          <w:instrText xml:space="preserve"> PAGEREF _Toc203487709 \h </w:instrText>
+        </w:r>
+        <w:r>
+          <w:rPr>
+            <w:noProof/>
+            <w:webHidden/>
+          </w:rPr>
+        </w:r>
+        <w:r>
+          <w:rPr>
+            <w:noProof/>
+            <w:webHidden/>
+          </w:rPr>
+          <w:fldChar w:fldCharType="separate"/>
+        </w:r>
+        <w:r>
+          <w:rPr>
+            <w:noProof/>
+            <w:webHidden/>
+          </w:rPr>
+          <w:t>4</w:t>
+        </w:r>
+        <w:r>
+          <w:rPr>
+            <w:noProof/>
+            <w:webHidden/>
+          </w:rPr>
+          <w:fldChar w:fldCharType="end"/>
+        </w:r>
+      </w:hyperlink>
+    </w:p>
+    <w:p>
+      <w:pPr>
+        <w:pStyle w:val="21"/>
+        <w:tabs>
+          <w:tab w:val="right" w:leader="dot" w:pos="9076"/>
+        </w:tabs>
+        <w:rPr>
+          <w:rFonts w:asciiTheme="minorHAnsi" w:eastAsiaTheme="minorEastAsia" w:hAnsiTheme="minorHAnsi" w:cstheme="minorBidi"/>
+          <w:noProof/>
+          <w:kern w:val="2"/>
+          <w:sz w:val="24"/>
+          <w:szCs w:val="24"/>
+          <w:lang w:val="ru-RU" w:eastAsia="ru-RU"/>
+          <w14:ligatures w14:val="standardContextual"/>
+        </w:rPr>
+      </w:pPr>
+      <w:hyperlink w:anchor="_Toc203487710" w:history="1">
+        <w:r>
+          <w:rPr>
+            <w:rStyle w:val="a9"/>
+            <w:rFonts w:eastAsiaTheme="majorEastAsia"/>
+            <w:noProof/>
+          </w:rPr>
+          <w:t>Відкрити папку з текстами</w:t>
+        </w:r>
+        <w:r>
+          <w:rPr>
+            <w:noProof/>
+            <w:webHidden/>
+          </w:rPr>
+          <w:tab/>
+        </w:r>
+        <w:r>
+          <w:rPr>
+            <w:noProof/>
+            <w:webHidden/>
+          </w:rPr>
+          <w:fldChar w:fldCharType="begin"/>
+        </w:r>
+        <w:r>
+          <w:rPr>
+            <w:noProof/>
+            <w:webHidden/>
+          </w:rPr>
+          <w:instrText xml:space="preserve"> PAGEREF _Toc203487710 \h </w:instrText>
+        </w:r>
+        <w:r>
+          <w:rPr>
+            <w:noProof/>
+            <w:webHidden/>
+          </w:rPr>
+        </w:r>
+        <w:r>
+          <w:rPr>
+            <w:noProof/>
+            <w:webHidden/>
+          </w:rPr>
+          <w:fldChar w:fldCharType="separate"/>
+        </w:r>
+        <w:r>
+          <w:rPr>
+            <w:noProof/>
+            <w:webHidden/>
+          </w:rPr>
+          <w:t>4</w:t>
+        </w:r>
+        <w:r>
+          <w:rPr>
+            <w:noProof/>
+            <w:webHidden/>
+          </w:rPr>
+          <w:fldChar w:fldCharType="end"/>
+        </w:r>
+      </w:hyperlink>
+    </w:p>
+    <w:p>
+      <w:pPr>
+        <w:pStyle w:val="21"/>
+        <w:tabs>
+          <w:tab w:val="right" w:leader="dot" w:pos="9076"/>
+        </w:tabs>
+        <w:rPr>
+          <w:rFonts w:asciiTheme="minorHAnsi" w:eastAsiaTheme="minorEastAsia" w:hAnsiTheme="minorHAnsi" w:cstheme="minorBidi"/>
+          <w:noProof/>
+          <w:kern w:val="2"/>
+          <w:sz w:val="24"/>
+          <w:szCs w:val="24"/>
+          <w:lang w:val="ru-RU" w:eastAsia="ru-RU"/>
+          <w14:ligatures w14:val="standardContextual"/>
+        </w:rPr>
+      </w:pPr>
+      <w:hyperlink w:anchor="_Toc203487711" w:history="1">
+        <w:r>
+          <w:rPr>
+            <w:rStyle w:val="a9"/>
+            <w:rFonts w:eastAsiaTheme="majorEastAsia"/>
+            <w:noProof/>
+          </w:rPr>
+          <w:t>Порахувати слова в текстах</w:t>
+        </w:r>
+        <w:r>
+          <w:rPr>
+            <w:noProof/>
+            <w:webHidden/>
+          </w:rPr>
+          <w:tab/>
+        </w:r>
+        <w:r>
+          <w:rPr>
+            <w:noProof/>
+            <w:webHidden/>
+          </w:rPr>
+          <w:fldChar w:fldCharType="begin"/>
+        </w:r>
+        <w:r>
+          <w:rPr>
+            <w:noProof/>
+            <w:webHidden/>
+          </w:rPr>
+          <w:instrText xml:space="preserve"> PAGEREF _Toc203487711 \h </w:instrText>
+        </w:r>
+        <w:r>
+          <w:rPr>
+            <w:noProof/>
+            <w:webHidden/>
+          </w:rPr>
+        </w:r>
+        <w:r>
+          <w:rPr>
+            <w:noProof/>
+            <w:webHidden/>
+          </w:rPr>
+          <w:fldChar w:fldCharType="separate"/>
+        </w:r>
+        <w:r>
+          <w:rPr>
+            <w:noProof/>
+            <w:webHidden/>
+          </w:rPr>
+          <w:t>4</w:t>
+        </w:r>
+        <w:r>
+          <w:rPr>
+            <w:noProof/>
+            <w:webHidden/>
+          </w:rPr>
+          <w:fldChar w:fldCharType="end"/>
+        </w:r>
+      </w:hyperlink>
+    </w:p>
+    <w:p>
+      <w:pPr>
+        <w:pStyle w:val="21"/>
+        <w:tabs>
+          <w:tab w:val="right" w:leader="dot" w:pos="9076"/>
+        </w:tabs>
+        <w:rPr>
+          <w:rFonts w:asciiTheme="minorHAnsi" w:eastAsiaTheme="minorEastAsia" w:hAnsiTheme="minorHAnsi" w:cstheme="minorBidi"/>
+          <w:noProof/>
+          <w:kern w:val="2"/>
+          <w:sz w:val="24"/>
+          <w:szCs w:val="24"/>
+          <w:lang w:val="ru-RU" w:eastAsia="ru-RU"/>
+          <w14:ligatures w14:val="standardContextual"/>
+        </w:rPr>
+      </w:pPr>
+      <w:hyperlink w:anchor="_Toc203487712" w:history="1">
+        <w:r>
+          <w:rPr>
+            <w:rStyle w:val="a9"/>
+            <w:rFonts w:eastAsiaTheme="majorEastAsia"/>
+            <w:noProof/>
+          </w:rPr>
+          <w:t>Порахувати символи в текстах</w:t>
+        </w:r>
+        <w:r>
+          <w:rPr>
+            <w:noProof/>
+            <w:webHidden/>
+          </w:rPr>
+          <w:tab/>
+        </w:r>
+        <w:r>
+          <w:rPr>
+            <w:noProof/>
+            <w:webHidden/>
+          </w:rPr>
+          <w:fldChar w:fldCharType="begin"/>
+        </w:r>
+        <w:r>
+          <w:rPr>
+            <w:noProof/>
+            <w:webHidden/>
+          </w:rPr>
+          <w:instrText xml:space="preserve"> PAGEREF _Toc203487712 \h </w:instrText>
+        </w:r>
+        <w:r>
+          <w:rPr>
+            <w:noProof/>
+            <w:webHidden/>
+          </w:rPr>
+        </w:r>
+        <w:r>
+          <w:rPr>
+            <w:noProof/>
+            <w:webHidden/>
+          </w:rPr>
+          <w:fldChar w:fldCharType="separate"/>
+        </w:r>
+        <w:r>
+          <w:rPr>
+            <w:noProof/>
+            <w:webHidden/>
+          </w:rPr>
+          <w:t>6</w:t>
+        </w:r>
+        <w:r>
+          <w:rPr>
+            <w:noProof/>
+            <w:webHidden/>
+          </w:rPr>
+          <w:fldChar w:fldCharType="end"/>
+        </w:r>
+      </w:hyperlink>
+    </w:p>
+    <w:p>
+      <w:pPr>
+        <w:pStyle w:val="21"/>
+        <w:tabs>
+          <w:tab w:val="right" w:leader="dot" w:pos="9076"/>
+        </w:tabs>
+        <w:rPr>
+          <w:rFonts w:asciiTheme="minorHAnsi" w:eastAsiaTheme="minorEastAsia" w:hAnsiTheme="minorHAnsi" w:cstheme="minorBidi"/>
+          <w:noProof/>
+          <w:kern w:val="2"/>
+          <w:sz w:val="24"/>
+          <w:szCs w:val="24"/>
+          <w:lang w:val="ru-RU" w:eastAsia="ru-RU"/>
+          <w14:ligatures w14:val="standardContextual"/>
+        </w:rPr>
+      </w:pPr>
+      <w:hyperlink w:anchor="_Toc203487713" w:history="1">
+        <w:r>
+          <w:rPr>
+            <w:rStyle w:val="a9"/>
+            <w:rFonts w:eastAsiaTheme="majorEastAsia"/>
+            <w:noProof/>
+          </w:rPr>
+          <w:t>Ігнорувати регістр</w:t>
+        </w:r>
+        <w:r>
+          <w:rPr>
+            <w:noProof/>
+            <w:webHidden/>
+          </w:rPr>
+          <w:tab/>
+        </w:r>
+        <w:r>
+          <w:rPr>
+            <w:noProof/>
+            <w:webHidden/>
+          </w:rPr>
+          <w:fldChar w:fldCharType="begin"/>
+        </w:r>
+        <w:r>
+          <w:rPr>
+            <w:noProof/>
+            <w:webHidden/>
+          </w:rPr>
+          <w:instrText xml:space="preserve"> PAGEREF _Toc203487713 \h </w:instrText>
+        </w:r>
+        <w:r>
+          <w:rPr>
+            <w:noProof/>
+            <w:webHidden/>
+          </w:rPr>
+        </w:r>
+        <w:r>
+          <w:rPr>
+            <w:noProof/>
+            <w:webHidden/>
+          </w:rPr>
+          <w:fldChar w:fldCharType="separate"/>
+        </w:r>
+        <w:r>
+          <w:rPr>
+            <w:noProof/>
+            <w:webHidden/>
+          </w:rPr>
+          <w:t>6</w:t>
+        </w:r>
+        <w:r>
+          <w:rPr>
+            <w:noProof/>
+            <w:webHidden/>
+          </w:rPr>
+          <w:fldChar w:fldCharType="end"/>
+        </w:r>
+      </w:hyperlink>
+    </w:p>
+    <w:p>
+      <w:pPr>
+        <w:pStyle w:val="21"/>
+        <w:tabs>
+          <w:tab w:val="right" w:leader="dot" w:pos="9076"/>
+        </w:tabs>
+        <w:rPr>
+          <w:rFonts w:asciiTheme="minorHAnsi" w:eastAsiaTheme="minorEastAsia" w:hAnsiTheme="minorHAnsi" w:cstheme="minorBidi"/>
+          <w:noProof/>
+          <w:kern w:val="2"/>
+          <w:sz w:val="24"/>
+          <w:szCs w:val="24"/>
+          <w:lang w:val="ru-RU" w:eastAsia="ru-RU"/>
+          <w14:ligatures w14:val="standardContextual"/>
+        </w:rPr>
+      </w:pPr>
+      <w:hyperlink w:anchor="_Toc203487714" w:history="1">
+        <w:r>
+          <w:rPr>
+            <w:rStyle w:val="a9"/>
+            <w:rFonts w:eastAsiaTheme="majorEastAsia"/>
+            <w:noProof/>
+          </w:rPr>
+          <w:t>З пропусками</w:t>
+        </w:r>
+        <w:r>
+          <w:rPr>
+            <w:noProof/>
+            <w:webHidden/>
+          </w:rPr>
+          <w:tab/>
+        </w:r>
+        <w:r>
+          <w:rPr>
+            <w:noProof/>
+            <w:webHidden/>
+          </w:rPr>
+          <w:fldChar w:fldCharType="begin"/>
+        </w:r>
+        <w:r>
+          <w:rPr>
+            <w:noProof/>
+            <w:webHidden/>
+          </w:rPr>
+          <w:instrText xml:space="preserve"> PAGEREF _Toc203487714 \h </w:instrText>
+        </w:r>
+        <w:r>
+          <w:rPr>
+            <w:noProof/>
+            <w:webHidden/>
+          </w:rPr>
+        </w:r>
+        <w:r>
+          <w:rPr>
+            <w:noProof/>
+            <w:webHidden/>
+          </w:rPr>
+          <w:fldChar w:fldCharType="separate"/>
+        </w:r>
+        <w:r>
+          <w:rPr>
+            <w:noProof/>
+            <w:webHidden/>
+          </w:rPr>
+          <w:t>7</w:t>
+        </w:r>
+        <w:r>
+          <w:rPr>
+            <w:noProof/>
+            <w:webHidden/>
+          </w:rPr>
+          <w:fldChar w:fldCharType="end"/>
+        </w:r>
+      </w:hyperlink>
+    </w:p>
+    <w:p>
+      <w:pPr>
+        <w:pStyle w:val="21"/>
+        <w:tabs>
+          <w:tab w:val="right" w:leader="dot" w:pos="9076"/>
+        </w:tabs>
+        <w:rPr>
+          <w:rFonts w:asciiTheme="minorHAnsi" w:eastAsiaTheme="minorEastAsia" w:hAnsiTheme="minorHAnsi" w:cstheme="minorBidi"/>
+          <w:noProof/>
+          <w:kern w:val="2"/>
+          <w:sz w:val="24"/>
+          <w:szCs w:val="24"/>
+          <w:lang w:val="ru-RU" w:eastAsia="ru-RU"/>
+          <w14:ligatures w14:val="standardContextual"/>
+        </w:rPr>
+      </w:pPr>
+      <w:hyperlink w:anchor="_Toc203487715" w:history="1">
+        <w:r>
+          <w:rPr>
+            <w:rStyle w:val="a9"/>
+            <w:rFonts w:eastAsiaTheme="majorEastAsia"/>
+            <w:noProof/>
+          </w:rPr>
+          <w:t>Відкрити словник</w:t>
+        </w:r>
+        <w:r>
+          <w:rPr>
+            <w:noProof/>
+            <w:webHidden/>
+          </w:rPr>
+          <w:tab/>
+        </w:r>
+        <w:r>
+          <w:rPr>
+            <w:noProof/>
+            <w:webHidden/>
+          </w:rPr>
+          <w:fldChar w:fldCharType="begin"/>
+        </w:r>
+        <w:r>
+          <w:rPr>
+            <w:noProof/>
+            <w:webHidden/>
+          </w:rPr>
+          <w:instrText xml:space="preserve"> PAGEREF _Toc203487715 \h </w:instrText>
+        </w:r>
+        <w:r>
+          <w:rPr>
+            <w:noProof/>
+            <w:webHidden/>
+          </w:rPr>
+        </w:r>
+        <w:r>
+          <w:rPr>
+            <w:noProof/>
+            <w:webHidden/>
+          </w:rPr>
+          <w:fldChar w:fldCharType="separate"/>
+        </w:r>
+        <w:r>
+          <w:rPr>
+            <w:noProof/>
+            <w:webHidden/>
+          </w:rPr>
+          <w:t>7</w:t>
+        </w:r>
+        <w:r>
+          <w:rPr>
+            <w:noProof/>
+            <w:webHidden/>
+          </w:rPr>
+          <w:fldChar w:fldCharType="end"/>
+        </w:r>
+      </w:hyperlink>
+    </w:p>
+    <w:p>
+      <w:pPr>
+        <w:pStyle w:val="21"/>
+        <w:tabs>
+          <w:tab w:val="right" w:leader="dot" w:pos="9076"/>
+        </w:tabs>
+        <w:rPr>
+          <w:rFonts w:asciiTheme="minorHAnsi" w:eastAsiaTheme="minorEastAsia" w:hAnsiTheme="minorHAnsi" w:cstheme="minorBidi"/>
+          <w:noProof/>
+          <w:kern w:val="2"/>
+          <w:sz w:val="24"/>
+          <w:szCs w:val="24"/>
+          <w:lang w:val="ru-RU" w:eastAsia="ru-RU"/>
+          <w14:ligatures w14:val="standardContextual"/>
+        </w:rPr>
+      </w:pPr>
+      <w:hyperlink w:anchor="_Toc203487716" w:history="1">
+        <w:r>
+          <w:rPr>
+            <w:rStyle w:val="a9"/>
+            <w:rFonts w:eastAsiaTheme="majorEastAsia"/>
+            <w:noProof/>
+          </w:rPr>
+          <w:t>Відкрити файл бінування</w:t>
+        </w:r>
+        <w:r>
+          <w:rPr>
+            <w:noProof/>
+            <w:webHidden/>
+          </w:rPr>
+          <w:tab/>
+        </w:r>
+        <w:r>
+          <w:rPr>
+            <w:noProof/>
+            <w:webHidden/>
+          </w:rPr>
+          <w:fldChar w:fldCharType="begin"/>
+        </w:r>
+        <w:r>
+          <w:rPr>
+            <w:noProof/>
+            <w:webHidden/>
+          </w:rPr>
+          <w:instrText xml:space="preserve"> PAGEREF _Toc203487716 \h </w:instrText>
+        </w:r>
+        <w:r>
+          <w:rPr>
+            <w:noProof/>
+            <w:webHidden/>
+          </w:rPr>
+        </w:r>
+        <w:r>
+          <w:rPr>
+            <w:noProof/>
+            <w:webHidden/>
+          </w:rPr>
+          <w:fldChar w:fldCharType="separate"/>
+        </w:r>
+        <w:r>
+          <w:rPr>
+            <w:noProof/>
+            <w:webHidden/>
+          </w:rPr>
+          <w:t>8</w:t>
+        </w:r>
+        <w:r>
+          <w:rPr>
+            <w:noProof/>
+            <w:webHidden/>
+          </w:rPr>
+          <w:fldChar w:fldCharType="end"/>
+        </w:r>
+      </w:hyperlink>
+    </w:p>
+    <w:p>
+      <w:pPr>
+        <w:pStyle w:val="21"/>
+        <w:tabs>
+          <w:tab w:val="right" w:leader="dot" w:pos="9076"/>
+        </w:tabs>
+        <w:rPr>
+          <w:rFonts w:asciiTheme="minorHAnsi" w:eastAsiaTheme="minorEastAsia" w:hAnsiTheme="minorHAnsi" w:cstheme="minorBidi"/>
+          <w:noProof/>
+          <w:kern w:val="2"/>
+          <w:sz w:val="24"/>
+          <w:szCs w:val="24"/>
+          <w:lang w:val="ru-RU" w:eastAsia="ru-RU"/>
+          <w14:ligatures w14:val="standardContextual"/>
+        </w:rPr>
+      </w:pPr>
+      <w:hyperlink w:anchor="_Toc203487717" w:history="1">
+        <w:r>
+          <w:rPr>
+            <w:rStyle w:val="a9"/>
+            <w:rFonts w:eastAsiaTheme="majorEastAsia"/>
+            <w:noProof/>
+          </w:rPr>
+          <w:t>Зберегти словник у декількох форматах</w:t>
+        </w:r>
+        <w:r>
+          <w:rPr>
+            <w:noProof/>
+            <w:webHidden/>
+          </w:rPr>
+          <w:tab/>
+        </w:r>
+        <w:r>
+          <w:rPr>
+            <w:noProof/>
+            <w:webHidden/>
+          </w:rPr>
+          <w:fldChar w:fldCharType="begin"/>
+        </w:r>
+        <w:r>
+          <w:rPr>
+            <w:noProof/>
+            <w:webHidden/>
+          </w:rPr>
+          <w:instrText xml:space="preserve"> PAGEREF _Toc203487717 \h </w:instrText>
+        </w:r>
+        <w:r>
+          <w:rPr>
+            <w:noProof/>
+            <w:webHidden/>
+          </w:rPr>
+        </w:r>
+        <w:r>
+          <w:rPr>
+            <w:noProof/>
+            <w:webHidden/>
+          </w:rPr>
+          <w:fldChar w:fldCharType="separate"/>
+        </w:r>
+        <w:r>
+          <w:rPr>
+            <w:noProof/>
+            <w:webHidden/>
+          </w:rPr>
+          <w:t>9</w:t>
+        </w:r>
+        <w:r>
+          <w:rPr>
+            <w:noProof/>
+            <w:webHidden/>
+          </w:rPr>
+          <w:fldChar w:fldCharType="end"/>
+        </w:r>
+      </w:hyperlink>
+    </w:p>
+    <w:p>
+      <w:pPr>
+        <w:pStyle w:val="21"/>
+        <w:tabs>
+          <w:tab w:val="right" w:leader="dot" w:pos="9076"/>
+        </w:tabs>
+        <w:rPr>
+          <w:rFonts w:asciiTheme="minorHAnsi" w:eastAsiaTheme="minorEastAsia" w:hAnsiTheme="minorHAnsi" w:cstheme="minorBidi"/>
+          <w:noProof/>
+          <w:kern w:val="2"/>
+          <w:sz w:val="24"/>
+          <w:szCs w:val="24"/>
+          <w:lang w:val="ru-RU" w:eastAsia="ru-RU"/>
+          <w14:ligatures w14:val="standardContextual"/>
+        </w:rPr>
+      </w:pPr>
+      <w:hyperlink w:anchor="_Toc203487718" w:history="1">
+        <w:r>
+          <w:rPr>
+            <w:rStyle w:val="a9"/>
+            <w:rFonts w:eastAsiaTheme="majorEastAsia"/>
+            <w:noProof/>
+          </w:rPr>
+          <w:t>Зберегти файл бінування у декількох форматах</w:t>
+        </w:r>
+        <w:r>
+          <w:rPr>
+            <w:noProof/>
+            <w:webHidden/>
+          </w:rPr>
+          <w:tab/>
+        </w:r>
+        <w:r>
+          <w:rPr>
+            <w:noProof/>
+            <w:webHidden/>
+          </w:rPr>
+          <w:fldChar w:fldCharType="begin"/>
+        </w:r>
+        <w:r>
+          <w:rPr>
+            <w:noProof/>
+            <w:webHidden/>
+          </w:rPr>
+          <w:instrText xml:space="preserve"> PAGEREF _Toc203487718 \h </w:instrText>
+        </w:r>
+        <w:r>
+          <w:rPr>
+            <w:noProof/>
+            <w:webHidden/>
+          </w:rPr>
+        </w:r>
+        <w:r>
+          <w:rPr>
+            <w:noProof/>
+            <w:webHidden/>
+          </w:rPr>
+          <w:fldChar w:fldCharType="separate"/>
+        </w:r>
+        <w:r>
+          <w:rPr>
+            <w:noProof/>
+            <w:webHidden/>
+          </w:rPr>
+          <w:t>11</w:t>
+        </w:r>
+        <w:r>
+          <w:rPr>
+            <w:noProof/>
+            <w:webHidden/>
+          </w:rPr>
+          <w:fldChar w:fldCharType="end"/>
+        </w:r>
+      </w:hyperlink>
+    </w:p>
+    <w:p>
+      <w:pPr>
+        <w:pStyle w:val="21"/>
+        <w:tabs>
+          <w:tab w:val="right" w:leader="dot" w:pos="9076"/>
+        </w:tabs>
+        <w:rPr>
+          <w:rFonts w:asciiTheme="minorHAnsi" w:eastAsiaTheme="minorEastAsia" w:hAnsiTheme="minorHAnsi" w:cstheme="minorBidi"/>
+          <w:noProof/>
+          <w:kern w:val="2"/>
+          <w:sz w:val="24"/>
+          <w:szCs w:val="24"/>
+          <w:lang w:val="ru-RU" w:eastAsia="ru-RU"/>
+          <w14:ligatures w14:val="standardContextual"/>
+        </w:rPr>
+      </w:pPr>
+      <w:hyperlink w:anchor="_Toc203487719" w:history="1">
+        <w:r>
+          <w:rPr>
+            <w:rStyle w:val="a9"/>
+            <w:rFonts w:eastAsiaTheme="majorEastAsia"/>
+            <w:noProof/>
+          </w:rPr>
+          <w:t>Зберегти графік</w:t>
+        </w:r>
+        <w:r>
+          <w:rPr>
+            <w:noProof/>
+            <w:webHidden/>
+          </w:rPr>
+          <w:tab/>
+        </w:r>
+        <w:r>
+          <w:rPr>
+            <w:noProof/>
+            <w:webHidden/>
+          </w:rPr>
+          <w:fldChar w:fldCharType="begin"/>
+        </w:r>
+        <w:r>
+          <w:rPr>
+            <w:noProof/>
+            <w:webHidden/>
+          </w:rPr>
+          <w:instrText xml:space="preserve"> PAGEREF _Toc203487719 \h </w:instrText>
+        </w:r>
+        <w:r>
+          <w:rPr>
+            <w:noProof/>
+            <w:webHidden/>
+          </w:rPr>
+        </w:r>
+        <w:r>
+          <w:rPr>
+            <w:noProof/>
+            <w:webHidden/>
+          </w:rPr>
+          <w:fldChar w:fldCharType="separate"/>
+        </w:r>
+        <w:r>
+          <w:rPr>
+            <w:noProof/>
+            <w:webHidden/>
+          </w:rPr>
+          <w:t>13</w:t>
+        </w:r>
+        <w:r>
+          <w:rPr>
+            <w:noProof/>
+            <w:webHidden/>
+          </w:rPr>
+          <w:fldChar w:fldCharType="end"/>
+        </w:r>
+      </w:hyperlink>
+    </w:p>
+    <w:p>
+      <w:r>
+        <w:fldChar w:fldCharType="end"/>
+      </w:r>
+    </w:p>
+    <w:p>
+      <w:r>
+        <w:br w:type="page"/>
+      </w:r>
     </w:p>
     <w:p>
       <w:pPr>
@@ -674,21 +1613,29 @@
         <w:ind w:firstLine="426"/>
         <w:jc w:val="both"/>
         <w:rPr>
+          <w:noProof/>
+          <w:sz w:val="28"/>
+          <w:szCs w:val="28"/>
+          <w:lang w:val="en-US"/>
+        </w:rPr>
+      </w:pPr>
+      <w:r>
+        <w:rPr>
           <w:b/>
           <w:noProof/>
           <w:sz w:val="28"/>
           <w:szCs w:val="28"/>
         </w:rPr>
-      </w:pPr>
-      <w:r>
-        <w:rPr>
-          <w:b/>
-          <w:noProof/>
-          <w:sz w:val="28"/>
-          <w:szCs w:val="28"/>
-        </w:rPr>
         <w:lastRenderedPageBreak/>
-        <w:t>Зміст</w:t>
+        <w:t xml:space="preserve">Мета роботи: </w:t>
+      </w:r>
+      <w:r>
+        <w:rPr>
+          <w:noProof/>
+          <w:sz w:val="28"/>
+          <w:szCs w:val="28"/>
+        </w:rPr>
+        <w:t>Написати програму для парсингу декількох текстових файлів і бінування отриманих даних.</w:t>
       </w:r>
     </w:p>
     <w:p>
@@ -697,34 +1644,6 @@
         <w:ind w:firstLine="426"/>
         <w:jc w:val="both"/>
         <w:rPr>
-          <w:noProof/>
-          <w:sz w:val="28"/>
-          <w:szCs w:val="28"/>
-        </w:rPr>
-      </w:pPr>
-      <w:r>
-        <w:rPr>
-          <w:b/>
-          <w:noProof/>
-          <w:sz w:val="28"/>
-          <w:szCs w:val="28"/>
-        </w:rPr>
-        <w:t xml:space="preserve">Мета роботи : </w:t>
-      </w:r>
-      <w:r>
-        <w:rPr>
-          <w:noProof/>
-          <w:sz w:val="28"/>
-          <w:szCs w:val="28"/>
-        </w:rPr>
-        <w:t>Написати програму для парсингу декількох текстових файлів і бінування отриманих даних.</w:t>
-      </w:r>
-    </w:p>
-    <w:p>
-      <w:pPr>
-        <w:spacing w:line="360" w:lineRule="auto"/>
-        <w:jc w:val="center"/>
-        <w:rPr>
           <w:b/>
           <w:bCs/>
           <w:noProof/>
@@ -739,193 +1658,11 @@
           <w:noProof/>
           <w:sz w:val="28"/>
           <w:szCs w:val="28"/>
-        </w:rPr>
-        <w:t>Хід роботи(інструкція)</w:t>
-      </w:r>
-    </w:p>
-    <w:p>
-      <w:pPr>
-        <w:spacing w:line="360" w:lineRule="auto"/>
-        <w:rPr>
-          <w:noProof/>
-          <w:sz w:val="28"/>
-          <w:szCs w:val="28"/>
-        </w:rPr>
-      </w:pPr>
-      <w:r>
-        <w:rPr>
-          <w:noProof/>
-          <w:sz w:val="28"/>
-          <w:szCs w:val="28"/>
-        </w:rPr>
-        <w:t>Основні елементи:</w:t>
-      </w:r>
-    </w:p>
-    <w:p>
-      <w:pPr>
-        <w:spacing w:line="360" w:lineRule="auto"/>
-        <w:rPr>
-          <w:noProof/>
-          <w:sz w:val="28"/>
-          <w:szCs w:val="28"/>
-        </w:rPr>
-      </w:pPr>
-      <w:r>
-        <w:rPr>
-          <w:noProof/>
-          <w:sz w:val="28"/>
-          <w:szCs w:val="28"/>
-        </w:rPr>
-        <w:t>Відкрити папку з текстами</w:t>
-      </w:r>
-    </w:p>
-    <w:p>
-      <w:pPr>
-        <w:spacing w:line="360" w:lineRule="auto"/>
-        <w:rPr>
-          <w:noProof/>
-          <w:sz w:val="28"/>
-          <w:szCs w:val="28"/>
-        </w:rPr>
-      </w:pPr>
-      <w:r>
-        <w:rPr>
-          <w:noProof/>
-          <w:sz w:val="28"/>
-          <w:szCs w:val="28"/>
-        </w:rPr>
-        <w:t>Порахувати слова в текстах</w:t>
-      </w:r>
-    </w:p>
-    <w:p>
-      <w:pPr>
-        <w:spacing w:line="360" w:lineRule="auto"/>
-        <w:rPr>
-          <w:noProof/>
-          <w:sz w:val="28"/>
-          <w:szCs w:val="28"/>
-        </w:rPr>
-      </w:pPr>
-      <w:r>
-        <w:rPr>
-          <w:noProof/>
-          <w:sz w:val="28"/>
-          <w:szCs w:val="28"/>
-        </w:rPr>
-        <w:t>Порахувати символи в текстах</w:t>
-      </w:r>
-    </w:p>
-    <w:p>
-      <w:pPr>
-        <w:spacing w:line="360" w:lineRule="auto"/>
-        <w:rPr>
-          <w:noProof/>
-          <w:sz w:val="28"/>
-          <w:szCs w:val="28"/>
-        </w:rPr>
-      </w:pPr>
-      <w:r>
-        <w:rPr>
-          <w:noProof/>
-          <w:sz w:val="28"/>
-          <w:szCs w:val="28"/>
-        </w:rPr>
-        <w:t>Ігнорувати регістр</w:t>
-      </w:r>
-    </w:p>
-    <w:p>
-      <w:pPr>
-        <w:spacing w:line="360" w:lineRule="auto"/>
-        <w:rPr>
-          <w:noProof/>
-          <w:sz w:val="28"/>
-          <w:szCs w:val="28"/>
-        </w:rPr>
-      </w:pPr>
-      <w:r>
-        <w:rPr>
-          <w:noProof/>
-          <w:sz w:val="28"/>
-          <w:szCs w:val="28"/>
-        </w:rPr>
-        <w:t>З пропусками</w:t>
-      </w:r>
-    </w:p>
-    <w:p>
-      <w:pPr>
-        <w:spacing w:line="360" w:lineRule="auto"/>
-        <w:rPr>
-          <w:noProof/>
-          <w:sz w:val="28"/>
-          <w:szCs w:val="28"/>
-        </w:rPr>
-      </w:pPr>
-      <w:r>
-        <w:rPr>
-          <w:noProof/>
-          <w:sz w:val="28"/>
-          <w:szCs w:val="28"/>
-        </w:rPr>
-        <w:t>Відкрити словник</w:t>
-      </w:r>
-    </w:p>
-    <w:p>
-      <w:pPr>
-        <w:spacing w:line="360" w:lineRule="auto"/>
-        <w:rPr>
-          <w:noProof/>
-          <w:sz w:val="28"/>
-          <w:szCs w:val="28"/>
-        </w:rPr>
-      </w:pPr>
-      <w:r>
-        <w:rPr>
-          <w:noProof/>
-          <w:sz w:val="28"/>
-          <w:szCs w:val="28"/>
-        </w:rPr>
-        <w:t>Відкрити файл бінування</w:t>
-      </w:r>
-    </w:p>
-    <w:p>
-      <w:pPr>
-        <w:spacing w:line="360" w:lineRule="auto"/>
-        <w:rPr>
-          <w:noProof/>
-          <w:sz w:val="28"/>
-          <w:szCs w:val="28"/>
-        </w:rPr>
-      </w:pPr>
-      <w:r>
-        <w:rPr>
-          <w:noProof/>
-          <w:sz w:val="28"/>
-          <w:szCs w:val="28"/>
-        </w:rPr>
-        <w:t>Зберегти словник у декількох форматах</w:t>
-      </w:r>
-    </w:p>
-    <w:p>
-      <w:pPr>
-        <w:spacing w:line="360" w:lineRule="auto"/>
-        <w:rPr>
-          <w:noProof/>
-          <w:sz w:val="28"/>
-          <w:szCs w:val="28"/>
-        </w:rPr>
-      </w:pPr>
-      <w:r>
-        <w:rPr>
-          <w:noProof/>
-          <w:sz w:val="28"/>
-          <w:szCs w:val="28"/>
-        </w:rPr>
-        <w:t>Зберегти файл бінування у декількох форматах</w:t>
-      </w:r>
-    </w:p>
-    <w:p>
-      <w:pPr>
-        <w:spacing w:line="360" w:lineRule="auto"/>
+          <w:lang w:val="ru-RU"/>
+        </w:rPr>
+        <w:t>Репозитор</w:t>
+      </w:r>
+      <w:r>
         <w:rPr>
           <w:b/>
           <w:bCs/>
@@ -933,23 +1670,1843 @@
           <w:sz w:val="28"/>
           <w:szCs w:val="28"/>
         </w:rPr>
-      </w:pPr>
-      <w:r>
-        <w:rPr>
-          <w:noProof/>
-          <w:sz w:val="28"/>
-          <w:szCs w:val="28"/>
+        <w:t>ій</w:t>
+      </w:r>
+      <w:r>
+        <w:rPr>
+          <w:b/>
+          <w:bCs/>
+          <w:noProof/>
+          <w:sz w:val="28"/>
+          <w:szCs w:val="28"/>
+        </w:rPr>
+        <w:t xml:space="preserve">: </w:t>
+      </w:r>
+      <w:hyperlink r:id="rId9" w:history="1">
+        <w:r>
+          <w:rPr>
+            <w:rStyle w:val="a9"/>
+            <w:noProof/>
+            <w:sz w:val="28"/>
+            <w:szCs w:val="28"/>
+          </w:rPr>
+          <w:t>https://github.com/MaksimVarivodin/LanguageAnalysis/tree/UI_Functional_fix</w:t>
+        </w:r>
+      </w:hyperlink>
+    </w:p>
+    <w:p>
+      <w:pPr>
+        <w:spacing w:line="360" w:lineRule="auto"/>
+        <w:ind w:firstLine="426"/>
+        <w:jc w:val="both"/>
+        <w:rPr>
+          <w:b/>
+          <w:bCs/>
+          <w:noProof/>
+          <w:sz w:val="28"/>
+          <w:szCs w:val="28"/>
+        </w:rPr>
+      </w:pPr>
+      <w:r>
+        <w:rPr>
+          <w:b/>
+          <w:bCs/>
+          <w:noProof/>
+          <w:sz w:val="28"/>
+          <w:szCs w:val="28"/>
+        </w:rPr>
+        <w:t xml:space="preserve">Ключові зміни і вимоги: </w:t>
+      </w:r>
+    </w:p>
+    <w:p>
+      <w:pPr>
+        <w:pStyle w:val="a4"/>
+        <w:numPr>
+          <w:ilvl w:val="0"/>
+          <w:numId w:val="3"/>
+        </w:numPr>
+        <w:spacing w:line="360" w:lineRule="auto"/>
+        <w:ind w:left="1134" w:hanging="708"/>
+        <w:jc w:val="both"/>
+        <w:rPr>
+          <w:noProof/>
+          <w:sz w:val="28"/>
+          <w:szCs w:val="28"/>
+        </w:rPr>
+      </w:pPr>
+      <w:r>
+        <w:rPr>
+          <w:noProof/>
+          <w:sz w:val="28"/>
+          <w:szCs w:val="28"/>
+        </w:rPr>
+        <w:t>Працездатність програми при різних масштабах екрану і різній роздільній здатності(100%, 125%, 150%, 175%)</w:t>
+      </w:r>
+    </w:p>
+    <w:p>
+      <w:pPr>
+        <w:pStyle w:val="a4"/>
+        <w:numPr>
+          <w:ilvl w:val="0"/>
+          <w:numId w:val="3"/>
+        </w:numPr>
+        <w:spacing w:line="360" w:lineRule="auto"/>
+        <w:ind w:hanging="708"/>
+        <w:jc w:val="both"/>
+        <w:rPr>
+          <w:noProof/>
+          <w:sz w:val="28"/>
+          <w:szCs w:val="28"/>
+        </w:rPr>
+      </w:pPr>
+      <w:r>
+        <w:rPr>
+          <w:noProof/>
+          <w:sz w:val="28"/>
+          <w:szCs w:val="28"/>
+        </w:rPr>
+        <w:t>Відкриття і парсинг текстів.</w:t>
+      </w:r>
+    </w:p>
+    <w:p>
+      <w:pPr>
+        <w:pStyle w:val="a4"/>
+        <w:numPr>
+          <w:ilvl w:val="0"/>
+          <w:numId w:val="3"/>
+        </w:numPr>
+        <w:spacing w:line="360" w:lineRule="auto"/>
+        <w:ind w:hanging="708"/>
+        <w:jc w:val="both"/>
+        <w:rPr>
+          <w:noProof/>
+          <w:sz w:val="28"/>
+          <w:szCs w:val="28"/>
+        </w:rPr>
+      </w:pPr>
+      <w:r>
+        <w:rPr>
+          <w:noProof/>
+          <w:sz w:val="28"/>
+          <w:szCs w:val="28"/>
+        </w:rPr>
+        <w:t>Створення словників для папок з текстами.</w:t>
+      </w:r>
+    </w:p>
+    <w:p>
+      <w:pPr>
+        <w:pStyle w:val="a4"/>
+        <w:numPr>
+          <w:ilvl w:val="0"/>
+          <w:numId w:val="3"/>
+        </w:numPr>
+        <w:spacing w:line="360" w:lineRule="auto"/>
+        <w:ind w:hanging="708"/>
+        <w:jc w:val="both"/>
+        <w:rPr>
+          <w:noProof/>
+          <w:sz w:val="28"/>
+          <w:szCs w:val="28"/>
+        </w:rPr>
+      </w:pPr>
+      <w:r>
+        <w:rPr>
+          <w:noProof/>
+          <w:sz w:val="28"/>
+          <w:szCs w:val="28"/>
+        </w:rPr>
+        <w:t>Розрахунок б</w:t>
+      </w:r>
+      <w:r>
+        <w:rPr>
+          <w:noProof/>
+          <w:sz w:val="28"/>
+          <w:szCs w:val="28"/>
+        </w:rPr>
+        <w:t xml:space="preserve">інування </w:t>
+      </w:r>
+      <w:r>
+        <w:rPr>
+          <w:noProof/>
+          <w:sz w:val="28"/>
+          <w:szCs w:val="28"/>
+        </w:rPr>
+        <w:t>словників за різними методами.</w:t>
+      </w:r>
+    </w:p>
+    <w:p>
+      <w:pPr>
+        <w:rPr>
+          <w:noProof/>
+          <w:sz w:val="28"/>
+          <w:szCs w:val="28"/>
+        </w:rPr>
+      </w:pPr>
+      <w:r>
+        <w:rPr>
+          <w:noProof/>
+          <w:sz w:val="28"/>
+          <w:szCs w:val="28"/>
+        </w:rPr>
+        <w:br w:type="page"/>
+      </w:r>
+    </w:p>
+    <w:p>
+      <w:pPr>
+        <w:pStyle w:val="a7"/>
+        <w:rPr>
+          <w:noProof/>
+          <w:lang w:val="en-US"/>
+        </w:rPr>
+      </w:pPr>
+      <w:bookmarkStart w:id="1" w:name="_Toc203487709"/>
+      <w:r>
+        <w:rPr>
+          <w:noProof/>
+        </w:rPr>
+        <w:lastRenderedPageBreak/>
+        <w:t>Хід роботи(інструкція)</w:t>
+      </w:r>
+      <w:bookmarkEnd w:id="1"/>
+    </w:p>
+    <w:p>
+      <w:pPr>
+        <w:rPr>
+          <w:lang w:val="en-US"/>
+        </w:rPr>
+      </w:pPr>
+    </w:p>
+    <w:p>
+      <w:pPr>
+        <w:pStyle w:val="1"/>
+        <w:jc w:val="center"/>
+        <w:rPr>
+          <w:noProof/>
+        </w:rPr>
+      </w:pPr>
+      <w:bookmarkStart w:id="2" w:name="_Toc203487710"/>
+      <w:r>
+        <w:rPr>
+          <w:noProof/>
+        </w:rPr>
+        <w:t>Відкрити папку з текстами</w:t>
+      </w:r>
+      <w:bookmarkEnd w:id="2"/>
+    </w:p>
+    <w:p>
+      <w:pPr>
+        <w:jc w:val="center"/>
+        <w:rPr>
+          <w:noProof/>
+        </w:rPr>
+      </w:pPr>
+      <w:r>
+        <w:rPr>
+          <w:noProof/>
+        </w:rPr>
+        <w:drawing>
+          <wp:inline distT="0" distB="0" distL="0" distR="0" wp14:anchorId="2F209EA4" wp14:editId="57993CC1">
+            <wp:extent cx="4112802" cy="2905125"/>
+            <wp:effectExtent l="0" t="0" r="2540" b="0"/>
+            <wp:docPr id="2063463069" name="Рисунок 1"/>
+            <wp:cNvGraphicFramePr>
+              <a:graphicFrameLocks xmlns:a="http://schemas.openxmlformats.org/drawingml/2006/main" noChangeAspect="1"/>
+            </wp:cNvGraphicFramePr>
+            <a:graphic xmlns:a="http://schemas.openxmlformats.org/drawingml/2006/main">
+              <a:graphicData uri="http://schemas.openxmlformats.org/drawingml/2006/picture">
+                <pic:pic xmlns:pic="http://schemas.openxmlformats.org/drawingml/2006/picture">
+                  <pic:nvPicPr>
+                    <pic:cNvPr id="2063463069" name=""/>
+                    <pic:cNvPicPr/>
+                  </pic:nvPicPr>
+                  <pic:blipFill>
+                    <a:blip r:embed="rId10"/>
+                    <a:stretch>
+                      <a:fillRect/>
+                    </a:stretch>
+                  </pic:blipFill>
+                  <pic:spPr>
+                    <a:xfrm>
+                      <a:off x="0" y="0"/>
+                      <a:ext cx="4164572" cy="2941693"/>
+                    </a:xfrm>
+                    <a:prstGeom prst="rect">
+                      <a:avLst/>
+                    </a:prstGeom>
+                  </pic:spPr>
+                </pic:pic>
+              </a:graphicData>
+            </a:graphic>
+          </wp:inline>
+        </w:drawing>
+      </w:r>
+    </w:p>
+    <w:p>
+      <w:pPr>
+        <w:jc w:val="center"/>
+        <w:rPr>
+          <w:noProof/>
+        </w:rPr>
+      </w:pPr>
+      <w:r>
+        <w:rPr>
+          <w:noProof/>
+        </w:rPr>
+        <w:drawing>
+          <wp:inline distT="0" distB="0" distL="0" distR="0" wp14:anchorId="599CE26C" wp14:editId="15B788A3">
+            <wp:extent cx="4090357" cy="2590800"/>
+            <wp:effectExtent l="0" t="0" r="5715" b="0"/>
+            <wp:docPr id="1358376697" name="Рисунок 1" descr="Изображение выглядит как текст, снимок экрана, программное обеспечение, Значок на компьютере&#10;&#10;Содержимое, созданное искусственным интеллектом, может быть неверным."/>
+            <wp:cNvGraphicFramePr>
+              <a:graphicFrameLocks xmlns:a="http://schemas.openxmlformats.org/drawingml/2006/main" noChangeAspect="1"/>
+            </wp:cNvGraphicFramePr>
+            <a:graphic xmlns:a="http://schemas.openxmlformats.org/drawingml/2006/main">
+              <a:graphicData uri="http://schemas.openxmlformats.org/drawingml/2006/picture">
+                <pic:pic xmlns:pic="http://schemas.openxmlformats.org/drawingml/2006/picture">
+                  <pic:nvPicPr>
+                    <pic:cNvPr id="1358376697" name="Рисунок 1" descr="Изображение выглядит как текст, снимок экрана, программное обеспечение, Значок на компьютере&#10;&#10;Содержимое, созданное искусственным интеллектом, может быть неверным."/>
+                    <pic:cNvPicPr/>
+                  </pic:nvPicPr>
+                  <pic:blipFill>
+                    <a:blip r:embed="rId11"/>
+                    <a:stretch>
+                      <a:fillRect/>
+                    </a:stretch>
+                  </pic:blipFill>
+                  <pic:spPr>
+                    <a:xfrm>
+                      <a:off x="0" y="0"/>
+                      <a:ext cx="4119391" cy="2609190"/>
+                    </a:xfrm>
+                    <a:prstGeom prst="rect">
+                      <a:avLst/>
+                    </a:prstGeom>
+                  </pic:spPr>
+                </pic:pic>
+              </a:graphicData>
+            </a:graphic>
+          </wp:inline>
+        </w:drawing>
+      </w:r>
+    </w:p>
+    <w:p>
+      <w:pPr>
+        <w:jc w:val="center"/>
+        <w:rPr>
+          <w:noProof/>
+        </w:rPr>
+      </w:pPr>
+      <w:bookmarkStart w:id="3" w:name="_Toc203487711"/>
+      <w:r>
+        <w:rPr>
+          <w:b/>
+          <w:bCs/>
+          <w:noProof/>
+        </w:rPr>
+        <w:drawing>
+          <wp:inline distT="0" distB="0" distL="0" distR="0" wp14:anchorId="02978B5F" wp14:editId="4E01F7AE">
+            <wp:extent cx="4181475" cy="2958134"/>
+            <wp:effectExtent l="0" t="0" r="0" b="0"/>
+            <wp:docPr id="1844274868" name="Рисунок 1"/>
+            <wp:cNvGraphicFramePr>
+              <a:graphicFrameLocks xmlns:a="http://schemas.openxmlformats.org/drawingml/2006/main" noChangeAspect="1"/>
+            </wp:cNvGraphicFramePr>
+            <a:graphic xmlns:a="http://schemas.openxmlformats.org/drawingml/2006/main">
+              <a:graphicData uri="http://schemas.openxmlformats.org/drawingml/2006/picture">
+                <pic:pic xmlns:pic="http://schemas.openxmlformats.org/drawingml/2006/picture">
+                  <pic:nvPicPr>
+                    <pic:cNvPr id="0" name="Picture 1"/>
+                    <pic:cNvPicPr>
+                      <a:picLocks noChangeAspect="1" noChangeArrowheads="1"/>
+                    </pic:cNvPicPr>
+                  </pic:nvPicPr>
+                  <pic:blipFill>
+                    <a:blip r:embed="rId12">
+                      <a:extLst>
+                        <a:ext uri="{28A0092B-C50C-407E-A947-70E740481C1C}">
+                          <a14:useLocalDpi xmlns:a14="http://schemas.microsoft.com/office/drawing/2010/main" val="0"/>
+                        </a:ext>
+                      </a:extLst>
+                    </a:blip>
+                    <a:srcRect/>
+                    <a:stretch>
+                      <a:fillRect/>
+                    </a:stretch>
+                  </pic:blipFill>
+                  <pic:spPr bwMode="auto">
+                    <a:xfrm>
+                      <a:off x="0" y="0"/>
+                      <a:ext cx="4192288" cy="2965784"/>
+                    </a:xfrm>
+                    <a:prstGeom prst="rect">
+                      <a:avLst/>
+                    </a:prstGeom>
+                    <a:noFill/>
+                    <a:ln>
+                      <a:noFill/>
+                    </a:ln>
+                  </pic:spPr>
+                </pic:pic>
+              </a:graphicData>
+            </a:graphic>
+          </wp:inline>
+        </w:drawing>
+      </w:r>
+    </w:p>
+    <w:p>
+      <w:pPr>
+        <w:pStyle w:val="1"/>
+        <w:jc w:val="center"/>
+        <w:rPr>
+          <w:noProof/>
+        </w:rPr>
+      </w:pPr>
+      <w:r>
+        <w:rPr>
+          <w:noProof/>
+        </w:rPr>
+        <w:lastRenderedPageBreak/>
+        <w:t>Порахувати слова в текстах</w:t>
+      </w:r>
+      <w:bookmarkEnd w:id="3"/>
+    </w:p>
+    <w:p>
+      <w:pPr>
+        <w:jc w:val="center"/>
+        <w:rPr>
+          <w:noProof/>
+        </w:rPr>
+      </w:pPr>
+      <w:r>
+        <w:rPr>
+          <w:noProof/>
+        </w:rPr>
+        <w:drawing>
+          <wp:inline distT="0" distB="0" distL="0" distR="0" wp14:anchorId="4087993E" wp14:editId="509845D8">
+            <wp:extent cx="4286250" cy="2939130"/>
+            <wp:effectExtent l="0" t="0" r="0" b="0"/>
+            <wp:docPr id="1814607952" name="Рисунок 1"/>
+            <wp:cNvGraphicFramePr>
+              <a:graphicFrameLocks xmlns:a="http://schemas.openxmlformats.org/drawingml/2006/main" noChangeAspect="1"/>
+            </wp:cNvGraphicFramePr>
+            <a:graphic xmlns:a="http://schemas.openxmlformats.org/drawingml/2006/main">
+              <a:graphicData uri="http://schemas.openxmlformats.org/drawingml/2006/picture">
+                <pic:pic xmlns:pic="http://schemas.openxmlformats.org/drawingml/2006/picture">
+                  <pic:nvPicPr>
+                    <pic:cNvPr id="1814607952" name=""/>
+                    <pic:cNvPicPr/>
+                  </pic:nvPicPr>
+                  <pic:blipFill>
+                    <a:blip r:embed="rId13"/>
+                    <a:stretch>
+                      <a:fillRect/>
+                    </a:stretch>
+                  </pic:blipFill>
+                  <pic:spPr>
+                    <a:xfrm>
+                      <a:off x="0" y="0"/>
+                      <a:ext cx="4313950" cy="2958124"/>
+                    </a:xfrm>
+                    <a:prstGeom prst="rect">
+                      <a:avLst/>
+                    </a:prstGeom>
+                  </pic:spPr>
+                </pic:pic>
+              </a:graphicData>
+            </a:graphic>
+          </wp:inline>
+        </w:drawing>
+      </w:r>
+    </w:p>
+    <w:p>
+      <w:pPr>
+        <w:jc w:val="center"/>
+        <w:rPr>
+          <w:noProof/>
+        </w:rPr>
+      </w:pPr>
+      <w:r>
+        <w:rPr>
+          <w:noProof/>
+        </w:rPr>
+        <w:drawing>
+          <wp:inline distT="0" distB="0" distL="0" distR="0" wp14:anchorId="7A430349" wp14:editId="2327571A">
+            <wp:extent cx="4321969" cy="3057525"/>
+            <wp:effectExtent l="0" t="0" r="2540" b="0"/>
+            <wp:docPr id="777068247" name="Рисунок 2"/>
+            <wp:cNvGraphicFramePr>
+              <a:graphicFrameLocks xmlns:a="http://schemas.openxmlformats.org/drawingml/2006/main" noChangeAspect="1"/>
+            </wp:cNvGraphicFramePr>
+            <a:graphic xmlns:a="http://schemas.openxmlformats.org/drawingml/2006/main">
+              <a:graphicData uri="http://schemas.openxmlformats.org/drawingml/2006/picture">
+                <pic:pic xmlns:pic="http://schemas.openxmlformats.org/drawingml/2006/picture">
+                  <pic:nvPicPr>
+                    <pic:cNvPr id="0" name="Picture 2"/>
+                    <pic:cNvPicPr>
+                      <a:picLocks noChangeAspect="1" noChangeArrowheads="1"/>
+                    </pic:cNvPicPr>
+                  </pic:nvPicPr>
+                  <pic:blipFill>
+                    <a:blip r:embed="rId14">
+                      <a:extLst>
+                        <a:ext uri="{28A0092B-C50C-407E-A947-70E740481C1C}">
+                          <a14:useLocalDpi xmlns:a14="http://schemas.microsoft.com/office/drawing/2010/main" val="0"/>
+                        </a:ext>
+                      </a:extLst>
+                    </a:blip>
+                    <a:srcRect/>
+                    <a:stretch>
+                      <a:fillRect/>
+                    </a:stretch>
+                  </pic:blipFill>
+                  <pic:spPr bwMode="auto">
+                    <a:xfrm>
+                      <a:off x="0" y="0"/>
+                      <a:ext cx="4338516" cy="3069231"/>
+                    </a:xfrm>
+                    <a:prstGeom prst="rect">
+                      <a:avLst/>
+                    </a:prstGeom>
+                    <a:noFill/>
+                    <a:ln>
+                      <a:noFill/>
+                    </a:ln>
+                  </pic:spPr>
+                </pic:pic>
+              </a:graphicData>
+            </a:graphic>
+          </wp:inline>
+        </w:drawing>
+      </w:r>
+    </w:p>
+    <w:p>
+      <w:pPr>
+        <w:jc w:val="center"/>
+        <w:rPr>
+          <w:noProof/>
+        </w:rPr>
+      </w:pPr>
+      <w:r>
+        <w:rPr>
+          <w:noProof/>
+        </w:rPr>
+        <w:drawing>
+          <wp:inline distT="0" distB="0" distL="0" distR="0" wp14:anchorId="2AC7361D" wp14:editId="23B7ADCF">
+            <wp:extent cx="4321810" cy="3057413"/>
+            <wp:effectExtent l="0" t="0" r="2540" b="0"/>
+            <wp:docPr id="440071596" name="Рисунок 3"/>
+            <wp:cNvGraphicFramePr>
+              <a:graphicFrameLocks xmlns:a="http://schemas.openxmlformats.org/drawingml/2006/main" noChangeAspect="1"/>
+            </wp:cNvGraphicFramePr>
+            <a:graphic xmlns:a="http://schemas.openxmlformats.org/drawingml/2006/main">
+              <a:graphicData uri="http://schemas.openxmlformats.org/drawingml/2006/picture">
+                <pic:pic xmlns:pic="http://schemas.openxmlformats.org/drawingml/2006/picture">
+                  <pic:nvPicPr>
+                    <pic:cNvPr id="0" name="Picture 3"/>
+                    <pic:cNvPicPr>
+                      <a:picLocks noChangeAspect="1" noChangeArrowheads="1"/>
+                    </pic:cNvPicPr>
+                  </pic:nvPicPr>
+                  <pic:blipFill>
+                    <a:blip r:embed="rId15">
+                      <a:extLst>
+                        <a:ext uri="{28A0092B-C50C-407E-A947-70E740481C1C}">
+                          <a14:useLocalDpi xmlns:a14="http://schemas.microsoft.com/office/drawing/2010/main" val="0"/>
+                        </a:ext>
+                      </a:extLst>
+                    </a:blip>
+                    <a:srcRect/>
+                    <a:stretch>
+                      <a:fillRect/>
+                    </a:stretch>
+                  </pic:blipFill>
+                  <pic:spPr bwMode="auto">
+                    <a:xfrm>
+                      <a:off x="0" y="0"/>
+                      <a:ext cx="4347388" cy="3075508"/>
+                    </a:xfrm>
+                    <a:prstGeom prst="rect">
+                      <a:avLst/>
+                    </a:prstGeom>
+                    <a:noFill/>
+                    <a:ln>
+                      <a:noFill/>
+                    </a:ln>
+                  </pic:spPr>
+                </pic:pic>
+              </a:graphicData>
+            </a:graphic>
+          </wp:inline>
+        </w:drawing>
+      </w:r>
+    </w:p>
+    <w:p>
+      <w:pPr>
+        <w:jc w:val="center"/>
+        <w:rPr>
+          <w:noProof/>
+        </w:rPr>
+      </w:pPr>
+      <w:r>
+        <w:rPr>
+          <w:noProof/>
+        </w:rPr>
+        <w:lastRenderedPageBreak/>
+        <w:drawing>
+          <wp:inline distT="0" distB="0" distL="0" distR="0" wp14:anchorId="4365B630" wp14:editId="365BD25D">
+            <wp:extent cx="3743325" cy="2644311"/>
+            <wp:effectExtent l="0" t="0" r="0" b="3810"/>
+            <wp:docPr id="341479848" name="Рисунок 1"/>
+            <wp:cNvGraphicFramePr>
+              <a:graphicFrameLocks xmlns:a="http://schemas.openxmlformats.org/drawingml/2006/main" noChangeAspect="1"/>
+            </wp:cNvGraphicFramePr>
+            <a:graphic xmlns:a="http://schemas.openxmlformats.org/drawingml/2006/main">
+              <a:graphicData uri="http://schemas.openxmlformats.org/drawingml/2006/picture">
+                <pic:pic xmlns:pic="http://schemas.openxmlformats.org/drawingml/2006/picture">
+                  <pic:nvPicPr>
+                    <pic:cNvPr id="341479848" name=""/>
+                    <pic:cNvPicPr/>
+                  </pic:nvPicPr>
+                  <pic:blipFill>
+                    <a:blip r:embed="rId16"/>
+                    <a:stretch>
+                      <a:fillRect/>
+                    </a:stretch>
+                  </pic:blipFill>
+                  <pic:spPr>
+                    <a:xfrm>
+                      <a:off x="0" y="0"/>
+                      <a:ext cx="3807080" cy="2689348"/>
+                    </a:xfrm>
+                    <a:prstGeom prst="rect">
+                      <a:avLst/>
+                    </a:prstGeom>
+                  </pic:spPr>
+                </pic:pic>
+              </a:graphicData>
+            </a:graphic>
+          </wp:inline>
+        </w:drawing>
+      </w:r>
+    </w:p>
+    <w:p>
+      <w:pPr>
+        <w:pStyle w:val="1"/>
+        <w:jc w:val="center"/>
+        <w:rPr>
+          <w:noProof/>
+        </w:rPr>
+      </w:pPr>
+      <w:bookmarkStart w:id="4" w:name="_Toc203487712"/>
+      <w:r>
+        <w:rPr>
+          <w:noProof/>
+        </w:rPr>
+        <w:t>Порахувати символи в текстах</w:t>
+      </w:r>
+      <w:bookmarkEnd w:id="4"/>
+    </w:p>
+    <w:p>
+      <w:pPr>
+        <w:jc w:val="center"/>
+        <w:rPr>
+          <w:noProof/>
+        </w:rPr>
+      </w:pPr>
+      <w:r>
+        <w:rPr>
+          <w:noProof/>
+        </w:rPr>
+        <w:drawing>
+          <wp:inline distT="0" distB="0" distL="0" distR="0" wp14:anchorId="00C6E829" wp14:editId="1932671A">
+            <wp:extent cx="4139506" cy="2924175"/>
+            <wp:effectExtent l="0" t="0" r="0" b="0"/>
+            <wp:docPr id="1055342231" name="Рисунок 1"/>
+            <wp:cNvGraphicFramePr>
+              <a:graphicFrameLocks xmlns:a="http://schemas.openxmlformats.org/drawingml/2006/main" noChangeAspect="1"/>
+            </wp:cNvGraphicFramePr>
+            <a:graphic xmlns:a="http://schemas.openxmlformats.org/drawingml/2006/main">
+              <a:graphicData uri="http://schemas.openxmlformats.org/drawingml/2006/picture">
+                <pic:pic xmlns:pic="http://schemas.openxmlformats.org/drawingml/2006/picture">
+                  <pic:nvPicPr>
+                    <pic:cNvPr id="1055342231" name=""/>
+                    <pic:cNvPicPr/>
+                  </pic:nvPicPr>
+                  <pic:blipFill>
+                    <a:blip r:embed="rId17"/>
+                    <a:stretch>
+                      <a:fillRect/>
+                    </a:stretch>
+                  </pic:blipFill>
+                  <pic:spPr>
+                    <a:xfrm>
+                      <a:off x="0" y="0"/>
+                      <a:ext cx="4184737" cy="2956127"/>
+                    </a:xfrm>
+                    <a:prstGeom prst="rect">
+                      <a:avLst/>
+                    </a:prstGeom>
+                  </pic:spPr>
+                </pic:pic>
+              </a:graphicData>
+            </a:graphic>
+          </wp:inline>
+        </w:drawing>
+      </w:r>
+    </w:p>
+    <w:p>
+      <w:pPr>
+        <w:pStyle w:val="1"/>
+        <w:jc w:val="center"/>
+        <w:rPr>
+          <w:noProof/>
+        </w:rPr>
+      </w:pPr>
+      <w:bookmarkStart w:id="5" w:name="_Toc203487713"/>
+      <w:r>
+        <w:rPr>
+          <w:noProof/>
+        </w:rPr>
+        <w:t>Ігнорувати регістр</w:t>
+      </w:r>
+      <w:bookmarkEnd w:id="5"/>
+    </w:p>
+    <w:p>
+      <w:pPr>
+        <w:jc w:val="center"/>
+        <w:rPr>
+          <w:noProof/>
+        </w:rPr>
+      </w:pPr>
+      <w:r>
+        <w:rPr>
+          <w:noProof/>
+        </w:rPr>
+        <w:drawing>
+          <wp:inline distT="0" distB="0" distL="0" distR="0" wp14:anchorId="6C46FC22" wp14:editId="514FC16C">
+            <wp:extent cx="4562871" cy="2976113"/>
+            <wp:effectExtent l="0" t="0" r="0" b="0"/>
+            <wp:docPr id="1080401064" name="Рисунок 1" descr="Изображение выглядит как текст, снимок экрана, число, дисплей&#10;&#10;Содержимое, созданное искусственным интеллектом, может быть неверным."/>
+            <wp:cNvGraphicFramePr>
+              <a:graphicFrameLocks xmlns:a="http://schemas.openxmlformats.org/drawingml/2006/main" noChangeAspect="1"/>
+            </wp:cNvGraphicFramePr>
+            <a:graphic xmlns:a="http://schemas.openxmlformats.org/drawingml/2006/main">
+              <a:graphicData uri="http://schemas.openxmlformats.org/drawingml/2006/picture">
+                <pic:pic xmlns:pic="http://schemas.openxmlformats.org/drawingml/2006/picture">
+                  <pic:nvPicPr>
+                    <pic:cNvPr id="1080401064" name="Рисунок 1" descr="Изображение выглядит как текст, снимок экрана, число, дисплей&#10;&#10;Содержимое, созданное искусственным интеллектом, может быть неверным."/>
+                    <pic:cNvPicPr/>
+                  </pic:nvPicPr>
+                  <pic:blipFill>
+                    <a:blip r:embed="rId18"/>
+                    <a:stretch>
+                      <a:fillRect/>
+                    </a:stretch>
+                  </pic:blipFill>
+                  <pic:spPr>
+                    <a:xfrm>
+                      <a:off x="0" y="0"/>
+                      <a:ext cx="4586473" cy="2991508"/>
+                    </a:xfrm>
+                    <a:prstGeom prst="rect">
+                      <a:avLst/>
+                    </a:prstGeom>
+                  </pic:spPr>
+                </pic:pic>
+              </a:graphicData>
+            </a:graphic>
+          </wp:inline>
+        </w:drawing>
+      </w:r>
+    </w:p>
+    <w:p>
+      <w:pPr>
+        <w:pStyle w:val="1"/>
+        <w:jc w:val="center"/>
+        <w:rPr>
+          <w:noProof/>
+        </w:rPr>
+      </w:pPr>
+      <w:bookmarkStart w:id="6" w:name="_Toc203487714"/>
+      <w:r>
+        <w:rPr>
+          <w:noProof/>
+        </w:rPr>
+        <w:lastRenderedPageBreak/>
+        <w:t>З пропусками</w:t>
+      </w:r>
+      <w:bookmarkEnd w:id="6"/>
+    </w:p>
+    <w:p>
+      <w:pPr>
+        <w:jc w:val="center"/>
+        <w:rPr>
+          <w:noProof/>
+        </w:rPr>
+      </w:pPr>
+      <w:r>
+        <w:rPr>
+          <w:noProof/>
+        </w:rPr>
+        <w:drawing>
+          <wp:inline distT="0" distB="0" distL="0" distR="0" wp14:anchorId="0B3565F0" wp14:editId="511F14E2">
+            <wp:extent cx="4799959" cy="3010619"/>
+            <wp:effectExtent l="0" t="0" r="1270" b="0"/>
+            <wp:docPr id="278687963" name="Рисунок 4"/>
+            <wp:cNvGraphicFramePr>
+              <a:graphicFrameLocks xmlns:a="http://schemas.openxmlformats.org/drawingml/2006/main" noChangeAspect="1"/>
+            </wp:cNvGraphicFramePr>
+            <a:graphic xmlns:a="http://schemas.openxmlformats.org/drawingml/2006/main">
+              <a:graphicData uri="http://schemas.openxmlformats.org/drawingml/2006/picture">
+                <pic:pic xmlns:pic="http://schemas.openxmlformats.org/drawingml/2006/picture">
+                  <pic:nvPicPr>
+                    <pic:cNvPr id="0" name="Picture 4"/>
+                    <pic:cNvPicPr>
+                      <a:picLocks noChangeAspect="1" noChangeArrowheads="1"/>
+                    </pic:cNvPicPr>
+                  </pic:nvPicPr>
+                  <pic:blipFill>
+                    <a:blip r:embed="rId19">
+                      <a:extLst>
+                        <a:ext uri="{28A0092B-C50C-407E-A947-70E740481C1C}">
+                          <a14:useLocalDpi xmlns:a14="http://schemas.microsoft.com/office/drawing/2010/main" val="0"/>
+                        </a:ext>
+                      </a:extLst>
+                    </a:blip>
+                    <a:srcRect/>
+                    <a:stretch>
+                      <a:fillRect/>
+                    </a:stretch>
+                  </pic:blipFill>
+                  <pic:spPr bwMode="auto">
+                    <a:xfrm>
+                      <a:off x="0" y="0"/>
+                      <a:ext cx="4830513" cy="3029783"/>
+                    </a:xfrm>
+                    <a:prstGeom prst="rect">
+                      <a:avLst/>
+                    </a:prstGeom>
+                    <a:noFill/>
+                    <a:ln>
+                      <a:noFill/>
+                    </a:ln>
+                  </pic:spPr>
+                </pic:pic>
+              </a:graphicData>
+            </a:graphic>
+          </wp:inline>
+        </w:drawing>
+      </w:r>
+    </w:p>
+    <w:p>
+      <w:pPr>
+        <w:pStyle w:val="1"/>
+        <w:jc w:val="center"/>
+        <w:rPr>
+          <w:noProof/>
+        </w:rPr>
+      </w:pPr>
+      <w:bookmarkStart w:id="7" w:name="_Toc203487715"/>
+      <w:r>
+        <w:rPr>
+          <w:noProof/>
+        </w:rPr>
+        <w:t>Відкрити словник</w:t>
+      </w:r>
+      <w:bookmarkEnd w:id="7"/>
+    </w:p>
+    <w:p>
+      <w:pPr>
+        <w:jc w:val="center"/>
+        <w:rPr>
+          <w:noProof/>
+        </w:rPr>
+      </w:pPr>
+      <w:r>
+        <w:rPr>
+          <w:noProof/>
+        </w:rPr>
+        <w:drawing>
+          <wp:inline distT="0" distB="0" distL="0" distR="0" wp14:anchorId="64D2A10C" wp14:editId="0F2D8DF6">
+            <wp:extent cx="4249663" cy="3001992"/>
+            <wp:effectExtent l="0" t="0" r="0" b="8255"/>
+            <wp:docPr id="1224003574" name="Рисунок 1" descr="Изображение выглядит как текст, снимок экрана, число, диаграмма"/>
+            <wp:cNvGraphicFramePr>
+              <a:graphicFrameLocks xmlns:a="http://schemas.openxmlformats.org/drawingml/2006/main" noChangeAspect="1"/>
+            </wp:cNvGraphicFramePr>
+            <a:graphic xmlns:a="http://schemas.openxmlformats.org/drawingml/2006/main">
+              <a:graphicData uri="http://schemas.openxmlformats.org/drawingml/2006/picture">
+                <pic:pic xmlns:pic="http://schemas.openxmlformats.org/drawingml/2006/picture">
+                  <pic:nvPicPr>
+                    <pic:cNvPr id="1224003574" name="Рисунок 1" descr="Изображение выглядит как текст, снимок экрана, число, диаграмма"/>
+                    <pic:cNvPicPr/>
+                  </pic:nvPicPr>
+                  <pic:blipFill>
+                    <a:blip r:embed="rId20"/>
+                    <a:stretch>
+                      <a:fillRect/>
+                    </a:stretch>
+                  </pic:blipFill>
+                  <pic:spPr>
+                    <a:xfrm>
+                      <a:off x="0" y="0"/>
+                      <a:ext cx="4266509" cy="3013892"/>
+                    </a:xfrm>
+                    <a:prstGeom prst="rect">
+                      <a:avLst/>
+                    </a:prstGeom>
+                  </pic:spPr>
+                </pic:pic>
+              </a:graphicData>
+            </a:graphic>
+          </wp:inline>
+        </w:drawing>
+      </w:r>
+    </w:p>
+    <w:p>
+      <w:pPr>
+        <w:jc w:val="center"/>
+        <w:rPr>
+          <w:noProof/>
+        </w:rPr>
+      </w:pPr>
+      <w:r>
+        <w:rPr>
+          <w:noProof/>
+        </w:rPr>
+        <w:drawing>
+          <wp:inline distT="0" distB="0" distL="0" distR="0" wp14:anchorId="26C97E11" wp14:editId="2E23CD55">
+            <wp:extent cx="4270076" cy="2704758"/>
+            <wp:effectExtent l="0" t="0" r="0" b="635"/>
+            <wp:docPr id="2042716323" name="Рисунок 1"/>
+            <wp:cNvGraphicFramePr>
+              <a:graphicFrameLocks xmlns:a="http://schemas.openxmlformats.org/drawingml/2006/main" noChangeAspect="1"/>
+            </wp:cNvGraphicFramePr>
+            <a:graphic xmlns:a="http://schemas.openxmlformats.org/drawingml/2006/main">
+              <a:graphicData uri="http://schemas.openxmlformats.org/drawingml/2006/picture">
+                <pic:pic xmlns:pic="http://schemas.openxmlformats.org/drawingml/2006/picture">
+                  <pic:nvPicPr>
+                    <pic:cNvPr id="2042716323" name=""/>
+                    <pic:cNvPicPr/>
+                  </pic:nvPicPr>
+                  <pic:blipFill>
+                    <a:blip r:embed="rId21"/>
+                    <a:stretch>
+                      <a:fillRect/>
+                    </a:stretch>
+                  </pic:blipFill>
+                  <pic:spPr>
+                    <a:xfrm>
+                      <a:off x="0" y="0"/>
+                      <a:ext cx="4280629" cy="2711443"/>
+                    </a:xfrm>
+                    <a:prstGeom prst="rect">
+                      <a:avLst/>
+                    </a:prstGeom>
+                  </pic:spPr>
+                </pic:pic>
+              </a:graphicData>
+            </a:graphic>
+          </wp:inline>
+        </w:drawing>
+      </w:r>
+    </w:p>
+    <w:p>
+      <w:pPr>
+        <w:jc w:val="center"/>
+        <w:rPr>
+          <w:noProof/>
+        </w:rPr>
+      </w:pPr>
+      <w:r>
+        <w:rPr>
+          <w:noProof/>
+        </w:rPr>
+        <w:lastRenderedPageBreak/>
+        <w:drawing>
+          <wp:inline distT="0" distB="0" distL="0" distR="0" wp14:anchorId="1F9428F1" wp14:editId="05AF462D">
+            <wp:extent cx="4314794" cy="3048000"/>
+            <wp:effectExtent l="0" t="0" r="0" b="0"/>
+            <wp:docPr id="69483412" name="Рисунок 1"/>
+            <wp:cNvGraphicFramePr>
+              <a:graphicFrameLocks xmlns:a="http://schemas.openxmlformats.org/drawingml/2006/main" noChangeAspect="1"/>
+            </wp:cNvGraphicFramePr>
+            <a:graphic xmlns:a="http://schemas.openxmlformats.org/drawingml/2006/main">
+              <a:graphicData uri="http://schemas.openxmlformats.org/drawingml/2006/picture">
+                <pic:pic xmlns:pic="http://schemas.openxmlformats.org/drawingml/2006/picture">
+                  <pic:nvPicPr>
+                    <pic:cNvPr id="69483412" name=""/>
+                    <pic:cNvPicPr/>
+                  </pic:nvPicPr>
+                  <pic:blipFill>
+                    <a:blip r:embed="rId22"/>
+                    <a:stretch>
+                      <a:fillRect/>
+                    </a:stretch>
+                  </pic:blipFill>
+                  <pic:spPr>
+                    <a:xfrm>
+                      <a:off x="0" y="0"/>
+                      <a:ext cx="4328063" cy="3057373"/>
+                    </a:xfrm>
+                    <a:prstGeom prst="rect">
+                      <a:avLst/>
+                    </a:prstGeom>
+                  </pic:spPr>
+                </pic:pic>
+              </a:graphicData>
+            </a:graphic>
+          </wp:inline>
+        </w:drawing>
+      </w:r>
+    </w:p>
+    <w:p>
+      <w:pPr>
+        <w:pStyle w:val="1"/>
+        <w:jc w:val="center"/>
+        <w:rPr>
+          <w:noProof/>
+        </w:rPr>
+      </w:pPr>
+      <w:bookmarkStart w:id="8" w:name="_Toc203487716"/>
+      <w:r>
+        <w:rPr>
+          <w:noProof/>
+        </w:rPr>
+        <w:t>Відкрити файл бінування</w:t>
+      </w:r>
+      <w:bookmarkEnd w:id="8"/>
+    </w:p>
+    <w:p>
+      <w:pPr>
+        <w:jc w:val="center"/>
+      </w:pPr>
+      <w:r>
+        <w:rPr>
+          <w:noProof/>
+        </w:rPr>
+        <w:drawing>
+          <wp:inline distT="0" distB="0" distL="0" distR="0" wp14:anchorId="78402DD1" wp14:editId="6387CBD9">
+            <wp:extent cx="4328278" cy="3057525"/>
+            <wp:effectExtent l="0" t="0" r="0" b="0"/>
+            <wp:docPr id="1373753673" name="Рисунок 1" descr="Изображение выглядит как текст, снимок экрана, программное обеспечение, дисплей&#10;&#10;Содержимое, созданное искусственным интеллектом, может быть неверным."/>
+            <wp:cNvGraphicFramePr>
+              <a:graphicFrameLocks xmlns:a="http://schemas.openxmlformats.org/drawingml/2006/main" noChangeAspect="1"/>
+            </wp:cNvGraphicFramePr>
+            <a:graphic xmlns:a="http://schemas.openxmlformats.org/drawingml/2006/main">
+              <a:graphicData uri="http://schemas.openxmlformats.org/drawingml/2006/picture">
+                <pic:pic xmlns:pic="http://schemas.openxmlformats.org/drawingml/2006/picture">
+                  <pic:nvPicPr>
+                    <pic:cNvPr id="1373753673" name="Рисунок 1" descr="Изображение выглядит как текст, снимок экрана, программное обеспечение, дисплей&#10;&#10;Содержимое, созданное искусственным интеллектом, может быть неверным."/>
+                    <pic:cNvPicPr/>
+                  </pic:nvPicPr>
+                  <pic:blipFill>
+                    <a:blip r:embed="rId23"/>
+                    <a:stretch>
+                      <a:fillRect/>
+                    </a:stretch>
+                  </pic:blipFill>
+                  <pic:spPr>
+                    <a:xfrm>
+                      <a:off x="0" y="0"/>
+                      <a:ext cx="4352623" cy="3074722"/>
+                    </a:xfrm>
+                    <a:prstGeom prst="rect">
+                      <a:avLst/>
+                    </a:prstGeom>
+                  </pic:spPr>
+                </pic:pic>
+              </a:graphicData>
+            </a:graphic>
+          </wp:inline>
+        </w:drawing>
+      </w:r>
+    </w:p>
+    <w:p>
+      <w:pPr>
+        <w:jc w:val="center"/>
+      </w:pPr>
+      <w:r>
+        <w:rPr>
+          <w:noProof/>
+        </w:rPr>
+        <w:drawing>
+          <wp:inline distT="0" distB="0" distL="0" distR="0" wp14:anchorId="1E3938B7" wp14:editId="4D00B5F8">
+            <wp:extent cx="4333875" cy="2745168"/>
+            <wp:effectExtent l="0" t="0" r="0" b="0"/>
+            <wp:docPr id="700232748" name="Рисунок 1" descr="Изображение выглядит как текст, снимок экрана, программное обеспечение, Значок на компьютере&#10;&#10;Содержимое, созданное искусственным интеллектом, может быть неверным."/>
+            <wp:cNvGraphicFramePr>
+              <a:graphicFrameLocks xmlns:a="http://schemas.openxmlformats.org/drawingml/2006/main" noChangeAspect="1"/>
+            </wp:cNvGraphicFramePr>
+            <a:graphic xmlns:a="http://schemas.openxmlformats.org/drawingml/2006/main">
+              <a:graphicData uri="http://schemas.openxmlformats.org/drawingml/2006/picture">
+                <pic:pic xmlns:pic="http://schemas.openxmlformats.org/drawingml/2006/picture">
+                  <pic:nvPicPr>
+                    <pic:cNvPr id="700232748" name="Рисунок 1" descr="Изображение выглядит как текст, снимок экрана, программное обеспечение, Значок на компьютере&#10;&#10;Содержимое, созданное искусственным интеллектом, может быть неверным."/>
+                    <pic:cNvPicPr/>
+                  </pic:nvPicPr>
+                  <pic:blipFill>
+                    <a:blip r:embed="rId24"/>
+                    <a:stretch>
+                      <a:fillRect/>
+                    </a:stretch>
+                  </pic:blipFill>
+                  <pic:spPr>
+                    <a:xfrm>
+                      <a:off x="0" y="0"/>
+                      <a:ext cx="4367550" cy="2766498"/>
+                    </a:xfrm>
+                    <a:prstGeom prst="rect">
+                      <a:avLst/>
+                    </a:prstGeom>
+                  </pic:spPr>
+                </pic:pic>
+              </a:graphicData>
+            </a:graphic>
+          </wp:inline>
+        </w:drawing>
+      </w:r>
+    </w:p>
+    <w:p>
+      <w:pPr>
+        <w:jc w:val="center"/>
+      </w:pPr>
+      <w:r>
+        <w:rPr>
+          <w:noProof/>
+        </w:rPr>
+        <w:lastRenderedPageBreak/>
+        <w:drawing>
+          <wp:inline distT="0" distB="0" distL="0" distR="0" wp14:anchorId="59C78F9D" wp14:editId="4C00988F">
+            <wp:extent cx="4410075" cy="3115307"/>
+            <wp:effectExtent l="0" t="0" r="0" b="9525"/>
+            <wp:docPr id="34801520" name="Рисунок 1" descr="Изображение выглядит как текст, снимок экрана, дисплей, программное обеспечение&#10;&#10;Содержимое, созданное искусственным интеллектом, может быть неверным."/>
+            <wp:cNvGraphicFramePr>
+              <a:graphicFrameLocks xmlns:a="http://schemas.openxmlformats.org/drawingml/2006/main" noChangeAspect="1"/>
+            </wp:cNvGraphicFramePr>
+            <a:graphic xmlns:a="http://schemas.openxmlformats.org/drawingml/2006/main">
+              <a:graphicData uri="http://schemas.openxmlformats.org/drawingml/2006/picture">
+                <pic:pic xmlns:pic="http://schemas.openxmlformats.org/drawingml/2006/picture">
+                  <pic:nvPicPr>
+                    <pic:cNvPr id="34801520" name="Рисунок 1" descr="Изображение выглядит как текст, снимок экрана, дисплей, программное обеспечение&#10;&#10;Содержимое, созданное искусственным интеллектом, может быть неверным."/>
+                    <pic:cNvPicPr/>
+                  </pic:nvPicPr>
+                  <pic:blipFill>
+                    <a:blip r:embed="rId25"/>
+                    <a:stretch>
+                      <a:fillRect/>
+                    </a:stretch>
+                  </pic:blipFill>
+                  <pic:spPr>
+                    <a:xfrm>
+                      <a:off x="0" y="0"/>
+                      <a:ext cx="4433614" cy="3131935"/>
+                    </a:xfrm>
+                    <a:prstGeom prst="rect">
+                      <a:avLst/>
+                    </a:prstGeom>
+                  </pic:spPr>
+                </pic:pic>
+              </a:graphicData>
+            </a:graphic>
+          </wp:inline>
+        </w:drawing>
+      </w:r>
+    </w:p>
+    <w:p>
+      <w:pPr>
+        <w:pStyle w:val="1"/>
+        <w:jc w:val="center"/>
+        <w:rPr>
+          <w:noProof/>
+        </w:rPr>
+      </w:pPr>
+      <w:bookmarkStart w:id="9" w:name="_Toc203487717"/>
+      <w:r>
+        <w:rPr>
+          <w:noProof/>
+        </w:rPr>
+        <w:t>Зберегти словник у декількох форматах</w:t>
+      </w:r>
+      <w:bookmarkEnd w:id="9"/>
+    </w:p>
+    <w:p>
+      <w:pPr>
+        <w:jc w:val="center"/>
+      </w:pPr>
+      <w:r>
+        <w:rPr>
+          <w:noProof/>
+        </w:rPr>
+        <w:drawing>
+          <wp:inline distT="0" distB="0" distL="0" distR="0" wp14:anchorId="52A2EA57" wp14:editId="359FB239">
+            <wp:extent cx="4410075" cy="3115306"/>
+            <wp:effectExtent l="0" t="0" r="0" b="9525"/>
+            <wp:docPr id="890359437" name="Рисунок 1" descr="Изображение выглядит как текст, снимок экрана, дисплей, программное обеспечение&#10;&#10;Содержимое, созданное искусственным интеллектом, может быть неверным."/>
+            <wp:cNvGraphicFramePr>
+              <a:graphicFrameLocks xmlns:a="http://schemas.openxmlformats.org/drawingml/2006/main" noChangeAspect="1"/>
+            </wp:cNvGraphicFramePr>
+            <a:graphic xmlns:a="http://schemas.openxmlformats.org/drawingml/2006/main">
+              <a:graphicData uri="http://schemas.openxmlformats.org/drawingml/2006/picture">
+                <pic:pic xmlns:pic="http://schemas.openxmlformats.org/drawingml/2006/picture">
+                  <pic:nvPicPr>
+                    <pic:cNvPr id="890359437" name="Рисунок 1" descr="Изображение выглядит как текст, снимок экрана, дисплей, программное обеспечение&#10;&#10;Содержимое, созданное искусственным интеллектом, может быть неверным."/>
+                    <pic:cNvPicPr/>
+                  </pic:nvPicPr>
+                  <pic:blipFill>
+                    <a:blip r:embed="rId26"/>
+                    <a:stretch>
+                      <a:fillRect/>
+                    </a:stretch>
+                  </pic:blipFill>
+                  <pic:spPr>
+                    <a:xfrm>
+                      <a:off x="0" y="0"/>
+                      <a:ext cx="4436014" cy="3133630"/>
+                    </a:xfrm>
+                    <a:prstGeom prst="rect">
+                      <a:avLst/>
+                    </a:prstGeom>
+                  </pic:spPr>
+                </pic:pic>
+              </a:graphicData>
+            </a:graphic>
+          </wp:inline>
+        </w:drawing>
+      </w:r>
+    </w:p>
+    <w:p>
+      <w:pPr>
+        <w:jc w:val="center"/>
+      </w:pPr>
+      <w:r>
+        <w:rPr>
+          <w:noProof/>
+        </w:rPr>
+        <w:drawing>
+          <wp:inline distT="0" distB="0" distL="0" distR="0" wp14:anchorId="50BE5EB8" wp14:editId="291A2392">
+            <wp:extent cx="4457264" cy="2819400"/>
+            <wp:effectExtent l="0" t="0" r="635" b="0"/>
+            <wp:docPr id="461345663" name="Рисунок 1" descr="Изображение выглядит как текст, снимок экрана, программное обеспечение, дисплей&#10;&#10;Содержимое, созданное искусственным интеллектом, может быть неверным."/>
+            <wp:cNvGraphicFramePr>
+              <a:graphicFrameLocks xmlns:a="http://schemas.openxmlformats.org/drawingml/2006/main" noChangeAspect="1"/>
+            </wp:cNvGraphicFramePr>
+            <a:graphic xmlns:a="http://schemas.openxmlformats.org/drawingml/2006/main">
+              <a:graphicData uri="http://schemas.openxmlformats.org/drawingml/2006/picture">
+                <pic:pic xmlns:pic="http://schemas.openxmlformats.org/drawingml/2006/picture">
+                  <pic:nvPicPr>
+                    <pic:cNvPr id="461345663" name="Рисунок 1" descr="Изображение выглядит как текст, снимок экрана, программное обеспечение, дисплей&#10;&#10;Содержимое, созданное искусственным интеллектом, может быть неверным."/>
+                    <pic:cNvPicPr/>
+                  </pic:nvPicPr>
+                  <pic:blipFill>
+                    <a:blip r:embed="rId27"/>
+                    <a:stretch>
+                      <a:fillRect/>
+                    </a:stretch>
+                  </pic:blipFill>
+                  <pic:spPr>
+                    <a:xfrm>
+                      <a:off x="0" y="0"/>
+                      <a:ext cx="4475483" cy="2830924"/>
+                    </a:xfrm>
+                    <a:prstGeom prst="rect">
+                      <a:avLst/>
+                    </a:prstGeom>
+                  </pic:spPr>
+                </pic:pic>
+              </a:graphicData>
+            </a:graphic>
+          </wp:inline>
+        </w:drawing>
+      </w:r>
+    </w:p>
+    <w:p>
+      <w:pPr>
+        <w:jc w:val="center"/>
+      </w:pPr>
+      <w:r>
+        <w:rPr>
+          <w:noProof/>
+        </w:rPr>
+        <w:lastRenderedPageBreak/>
+        <w:drawing>
+          <wp:inline distT="0" distB="0" distL="0" distR="0" wp14:anchorId="5B202F82" wp14:editId="515BD38E">
+            <wp:extent cx="5191068" cy="4104167"/>
+            <wp:effectExtent l="0" t="0" r="0" b="0"/>
+            <wp:docPr id="1789739188" name="Рисунок 1"/>
+            <wp:cNvGraphicFramePr>
+              <a:graphicFrameLocks xmlns:a="http://schemas.openxmlformats.org/drawingml/2006/main" noChangeAspect="1"/>
+            </wp:cNvGraphicFramePr>
+            <a:graphic xmlns:a="http://schemas.openxmlformats.org/drawingml/2006/main">
+              <a:graphicData uri="http://schemas.openxmlformats.org/drawingml/2006/picture">
+                <pic:pic xmlns:pic="http://schemas.openxmlformats.org/drawingml/2006/picture">
+                  <pic:nvPicPr>
+                    <pic:cNvPr id="1789739188" name=""/>
+                    <pic:cNvPicPr/>
+                  </pic:nvPicPr>
+                  <pic:blipFill>
+                    <a:blip r:embed="rId28"/>
+                    <a:stretch>
+                      <a:fillRect/>
+                    </a:stretch>
+                  </pic:blipFill>
+                  <pic:spPr>
+                    <a:xfrm>
+                      <a:off x="0" y="0"/>
+                      <a:ext cx="5213466" cy="4121876"/>
+                    </a:xfrm>
+                    <a:prstGeom prst="rect">
+                      <a:avLst/>
+                    </a:prstGeom>
+                  </pic:spPr>
+                </pic:pic>
+              </a:graphicData>
+            </a:graphic>
+          </wp:inline>
+        </w:drawing>
+      </w:r>
+    </w:p>
+    <w:p>
+      <w:pPr>
+        <w:jc w:val="center"/>
+      </w:pPr>
+      <w:r>
+        <w:rPr>
+          <w:noProof/>
+        </w:rPr>
+        <w:drawing>
+          <wp:inline distT="0" distB="0" distL="0" distR="0" wp14:anchorId="6CAEE25E" wp14:editId="3CF11709">
+            <wp:extent cx="5363675" cy="4274289"/>
+            <wp:effectExtent l="0" t="0" r="8890" b="0"/>
+            <wp:docPr id="1914550982" name="Рисунок 1" descr="Изображение выглядит как текст, снимок экрана, число, программное обеспечение&#10;&#10;Содержимое, созданное искусственным интеллектом, может быть неверным."/>
+            <wp:cNvGraphicFramePr>
+              <a:graphicFrameLocks xmlns:a="http://schemas.openxmlformats.org/drawingml/2006/main" noChangeAspect="1"/>
+            </wp:cNvGraphicFramePr>
+            <a:graphic xmlns:a="http://schemas.openxmlformats.org/drawingml/2006/main">
+              <a:graphicData uri="http://schemas.openxmlformats.org/drawingml/2006/picture">
+                <pic:pic xmlns:pic="http://schemas.openxmlformats.org/drawingml/2006/picture">
+                  <pic:nvPicPr>
+                    <pic:cNvPr id="1914550982" name="Рисунок 1" descr="Изображение выглядит как текст, снимок экрана, число, программное обеспечение&#10;&#10;Содержимое, созданное искусственным интеллектом, может быть неверным."/>
+                    <pic:cNvPicPr/>
+                  </pic:nvPicPr>
+                  <pic:blipFill>
+                    <a:blip r:embed="rId29"/>
+                    <a:stretch>
+                      <a:fillRect/>
+                    </a:stretch>
+                  </pic:blipFill>
+                  <pic:spPr>
+                    <a:xfrm>
+                      <a:off x="0" y="0"/>
+                      <a:ext cx="5388404" cy="4293996"/>
+                    </a:xfrm>
+                    <a:prstGeom prst="rect">
+                      <a:avLst/>
+                    </a:prstGeom>
+                  </pic:spPr>
+                </pic:pic>
+              </a:graphicData>
+            </a:graphic>
+          </wp:inline>
+        </w:drawing>
+      </w:r>
+    </w:p>
+    <w:p>
+      <w:pPr>
+        <w:jc w:val="center"/>
+      </w:pPr>
+      <w:r>
+        <w:rPr>
+          <w:noProof/>
+        </w:rPr>
+        <w:lastRenderedPageBreak/>
+        <w:drawing>
+          <wp:inline distT="0" distB="0" distL="0" distR="0" wp14:anchorId="0CB12194" wp14:editId="686ACC5C">
+            <wp:extent cx="5358810" cy="4694562"/>
+            <wp:effectExtent l="0" t="0" r="0" b="0"/>
+            <wp:docPr id="630114409" name="Рисунок 1" descr="Изображение выглядит как текст, снимок экрана, программное обеспечение, число&#10;&#10;Содержимое, созданное искусственным интеллектом, может быть неверным."/>
+            <wp:cNvGraphicFramePr>
+              <a:graphicFrameLocks xmlns:a="http://schemas.openxmlformats.org/drawingml/2006/main" noChangeAspect="1"/>
+            </wp:cNvGraphicFramePr>
+            <a:graphic xmlns:a="http://schemas.openxmlformats.org/drawingml/2006/main">
+              <a:graphicData uri="http://schemas.openxmlformats.org/drawingml/2006/picture">
+                <pic:pic xmlns:pic="http://schemas.openxmlformats.org/drawingml/2006/picture">
+                  <pic:nvPicPr>
+                    <pic:cNvPr id="630114409" name="Рисунок 1" descr="Изображение выглядит как текст, снимок экрана, программное обеспечение, число&#10;&#10;Содержимое, созданное искусственным интеллектом, может быть неверным."/>
+                    <pic:cNvPicPr/>
+                  </pic:nvPicPr>
+                  <pic:blipFill>
+                    <a:blip r:embed="rId30"/>
+                    <a:stretch>
+                      <a:fillRect/>
+                    </a:stretch>
+                  </pic:blipFill>
+                  <pic:spPr>
+                    <a:xfrm>
+                      <a:off x="0" y="0"/>
+                      <a:ext cx="5378138" cy="4711494"/>
+                    </a:xfrm>
+                    <a:prstGeom prst="rect">
+                      <a:avLst/>
+                    </a:prstGeom>
+                  </pic:spPr>
+                </pic:pic>
+              </a:graphicData>
+            </a:graphic>
+          </wp:inline>
+        </w:drawing>
+      </w:r>
+    </w:p>
+    <w:p>
+      <w:pPr>
+        <w:pStyle w:val="1"/>
+        <w:jc w:val="center"/>
+        <w:rPr>
+          <w:noProof/>
+        </w:rPr>
+      </w:pPr>
+      <w:bookmarkStart w:id="10" w:name="_Toc203487718"/>
+      <w:r>
+        <w:rPr>
+          <w:noProof/>
+        </w:rPr>
+        <w:t>Зберегти файл бінування у декількох форматах</w:t>
+      </w:r>
+      <w:bookmarkEnd w:id="10"/>
+    </w:p>
+    <w:p>
+      <w:pPr>
+        <w:jc w:val="center"/>
+      </w:pPr>
+      <w:r>
+        <w:rPr>
+          <w:noProof/>
+        </w:rPr>
+        <w:drawing>
+          <wp:inline distT="0" distB="0" distL="0" distR="0" wp14:anchorId="45C3397E" wp14:editId="411F2704">
+            <wp:extent cx="5768340" cy="4074795"/>
+            <wp:effectExtent l="0" t="0" r="3810" b="1905"/>
+            <wp:docPr id="237931142" name="Рисунок 1" descr="Изображение выглядит как текст, электроника, снимок экрана, дисплей&#10;&#10;Содержимое, созданное искусственным интеллектом, может быть неверным."/>
+            <wp:cNvGraphicFramePr>
+              <a:graphicFrameLocks xmlns:a="http://schemas.openxmlformats.org/drawingml/2006/main" noChangeAspect="1"/>
+            </wp:cNvGraphicFramePr>
+            <a:graphic xmlns:a="http://schemas.openxmlformats.org/drawingml/2006/main">
+              <a:graphicData uri="http://schemas.openxmlformats.org/drawingml/2006/picture">
+                <pic:pic xmlns:pic="http://schemas.openxmlformats.org/drawingml/2006/picture">
+                  <pic:nvPicPr>
+                    <pic:cNvPr id="237931142" name="Рисунок 1" descr="Изображение выглядит как текст, электроника, снимок экрана, дисплей&#10;&#10;Содержимое, созданное искусственным интеллектом, может быть неверным."/>
+                    <pic:cNvPicPr/>
+                  </pic:nvPicPr>
+                  <pic:blipFill>
+                    <a:blip r:embed="rId31"/>
+                    <a:stretch>
+                      <a:fillRect/>
+                    </a:stretch>
+                  </pic:blipFill>
+                  <pic:spPr>
+                    <a:xfrm>
+                      <a:off x="0" y="0"/>
+                      <a:ext cx="5768340" cy="4074795"/>
+                    </a:xfrm>
+                    <a:prstGeom prst="rect">
+                      <a:avLst/>
+                    </a:prstGeom>
+                  </pic:spPr>
+                </pic:pic>
+              </a:graphicData>
+            </a:graphic>
+          </wp:inline>
+        </w:drawing>
+      </w:r>
+    </w:p>
+    <w:p>
+      <w:pPr>
+        <w:jc w:val="center"/>
+      </w:pPr>
+      <w:r>
+        <w:rPr>
+          <w:noProof/>
+        </w:rPr>
+        <w:lastRenderedPageBreak/>
+        <w:drawing>
+          <wp:inline distT="0" distB="0" distL="0" distR="0" wp14:anchorId="0CF0316E" wp14:editId="16AD1E91">
+            <wp:extent cx="5768340" cy="2635885"/>
+            <wp:effectExtent l="0" t="0" r="3810" b="0"/>
+            <wp:docPr id="284970618" name="Рисунок 1" descr="Изображение выглядит как текст, снимок экрана, программное обеспечение, число&#10;&#10;Содержимое, созданное искусственным интеллектом, может быть неверным."/>
+            <wp:cNvGraphicFramePr>
+              <a:graphicFrameLocks xmlns:a="http://schemas.openxmlformats.org/drawingml/2006/main" noChangeAspect="1"/>
+            </wp:cNvGraphicFramePr>
+            <a:graphic xmlns:a="http://schemas.openxmlformats.org/drawingml/2006/main">
+              <a:graphicData uri="http://schemas.openxmlformats.org/drawingml/2006/picture">
+                <pic:pic xmlns:pic="http://schemas.openxmlformats.org/drawingml/2006/picture">
+                  <pic:nvPicPr>
+                    <pic:cNvPr id="284970618" name="Рисунок 1" descr="Изображение выглядит как текст, снимок экрана, программное обеспечение, число&#10;&#10;Содержимое, созданное искусственным интеллектом, может быть неверным."/>
+                    <pic:cNvPicPr/>
+                  </pic:nvPicPr>
+                  <pic:blipFill>
+                    <a:blip r:embed="rId32"/>
+                    <a:stretch>
+                      <a:fillRect/>
+                    </a:stretch>
+                  </pic:blipFill>
+                  <pic:spPr>
+                    <a:xfrm>
+                      <a:off x="0" y="0"/>
+                      <a:ext cx="5768340" cy="2635885"/>
+                    </a:xfrm>
+                    <a:prstGeom prst="rect">
+                      <a:avLst/>
+                    </a:prstGeom>
+                  </pic:spPr>
+                </pic:pic>
+              </a:graphicData>
+            </a:graphic>
+          </wp:inline>
+        </w:drawing>
+      </w:r>
+    </w:p>
+    <w:p>
+      <w:pPr>
+        <w:jc w:val="center"/>
+      </w:pPr>
+      <w:r>
+        <w:rPr>
+          <w:noProof/>
+        </w:rPr>
+        <w:drawing>
+          <wp:inline distT="0" distB="0" distL="0" distR="0" wp14:anchorId="43626281" wp14:editId="48892A5F">
+            <wp:extent cx="5768340" cy="3171825"/>
+            <wp:effectExtent l="0" t="0" r="3810" b="9525"/>
+            <wp:docPr id="1385712014" name="Рисунок 1" descr="Изображение выглядит как текст, снимок экрана, программное обеспечение, Мультимедийное программное обеспечение&#10;&#10;Содержимое, созданное искусственным интеллектом, может быть неверным."/>
+            <wp:cNvGraphicFramePr>
+              <a:graphicFrameLocks xmlns:a="http://schemas.openxmlformats.org/drawingml/2006/main" noChangeAspect="1"/>
+            </wp:cNvGraphicFramePr>
+            <a:graphic xmlns:a="http://schemas.openxmlformats.org/drawingml/2006/main">
+              <a:graphicData uri="http://schemas.openxmlformats.org/drawingml/2006/picture">
+                <pic:pic xmlns:pic="http://schemas.openxmlformats.org/drawingml/2006/picture">
+                  <pic:nvPicPr>
+                    <pic:cNvPr id="1385712014" name="Рисунок 1" descr="Изображение выглядит как текст, снимок экрана, программное обеспечение, Мультимедийное программное обеспечение&#10;&#10;Содержимое, созданное искусственным интеллектом, может быть неверным."/>
+                    <pic:cNvPicPr/>
+                  </pic:nvPicPr>
+                  <pic:blipFill>
+                    <a:blip r:embed="rId33"/>
+                    <a:stretch>
+                      <a:fillRect/>
+                    </a:stretch>
+                  </pic:blipFill>
+                  <pic:spPr>
+                    <a:xfrm>
+                      <a:off x="0" y="0"/>
+                      <a:ext cx="5768340" cy="3171825"/>
+                    </a:xfrm>
+                    <a:prstGeom prst="rect">
+                      <a:avLst/>
+                    </a:prstGeom>
+                  </pic:spPr>
+                </pic:pic>
+              </a:graphicData>
+            </a:graphic>
+          </wp:inline>
+        </w:drawing>
+      </w:r>
+    </w:p>
+    <w:p>
+      <w:pPr>
+        <w:jc w:val="center"/>
+      </w:pPr>
+      <w:r>
+        <w:rPr>
+          <w:noProof/>
+        </w:rPr>
+        <w:drawing>
+          <wp:inline distT="0" distB="0" distL="0" distR="0" wp14:anchorId="6C90B7DA" wp14:editId="467DF05B">
+            <wp:extent cx="5768340" cy="3562985"/>
+            <wp:effectExtent l="0" t="0" r="3810" b="0"/>
+            <wp:docPr id="683771586" name="Рисунок 1" descr="Изображение выглядит как текст, снимок экрана, число, программное обеспечение&#10;&#10;Содержимое, созданное искусственным интеллектом, может быть неверным."/>
+            <wp:cNvGraphicFramePr>
+              <a:graphicFrameLocks xmlns:a="http://schemas.openxmlformats.org/drawingml/2006/main" noChangeAspect="1"/>
+            </wp:cNvGraphicFramePr>
+            <a:graphic xmlns:a="http://schemas.openxmlformats.org/drawingml/2006/main">
+              <a:graphicData uri="http://schemas.openxmlformats.org/drawingml/2006/picture">
+                <pic:pic xmlns:pic="http://schemas.openxmlformats.org/drawingml/2006/picture">
+                  <pic:nvPicPr>
+                    <pic:cNvPr id="683771586" name="Рисунок 1" descr="Изображение выглядит как текст, снимок экрана, число, программное обеспечение&#10;&#10;Содержимое, созданное искусственным интеллектом, может быть неверным."/>
+                    <pic:cNvPicPr/>
+                  </pic:nvPicPr>
+                  <pic:blipFill>
+                    <a:blip r:embed="rId34"/>
+                    <a:stretch>
+                      <a:fillRect/>
+                    </a:stretch>
+                  </pic:blipFill>
+                  <pic:spPr>
+                    <a:xfrm>
+                      <a:off x="0" y="0"/>
+                      <a:ext cx="5768340" cy="3562985"/>
+                    </a:xfrm>
+                    <a:prstGeom prst="rect">
+                      <a:avLst/>
+                    </a:prstGeom>
+                  </pic:spPr>
+                </pic:pic>
+              </a:graphicData>
+            </a:graphic>
+          </wp:inline>
+        </w:drawing>
+      </w:r>
+    </w:p>
+    <w:p>
+      <w:pPr>
+        <w:jc w:val="center"/>
+      </w:pPr>
+      <w:r>
+        <w:rPr>
+          <w:noProof/>
+        </w:rPr>
+        <w:lastRenderedPageBreak/>
+        <w:drawing>
+          <wp:inline distT="0" distB="0" distL="0" distR="0" wp14:anchorId="71D63080" wp14:editId="3AC37027">
+            <wp:extent cx="5486400" cy="2995657"/>
+            <wp:effectExtent l="0" t="0" r="0" b="0"/>
+            <wp:docPr id="76670588" name="Рисунок 1" descr="Изображение выглядит как текст, снимок экрана, число, программное обеспечение&#10;&#10;Содержимое, созданное искусственным интеллектом, может быть неверным."/>
+            <wp:cNvGraphicFramePr>
+              <a:graphicFrameLocks xmlns:a="http://schemas.openxmlformats.org/drawingml/2006/main" noChangeAspect="1"/>
+            </wp:cNvGraphicFramePr>
+            <a:graphic xmlns:a="http://schemas.openxmlformats.org/drawingml/2006/main">
+              <a:graphicData uri="http://schemas.openxmlformats.org/drawingml/2006/picture">
+                <pic:pic xmlns:pic="http://schemas.openxmlformats.org/drawingml/2006/picture">
+                  <pic:nvPicPr>
+                    <pic:cNvPr id="76670588" name="Рисунок 1" descr="Изображение выглядит как текст, снимок экрана, число, программное обеспечение&#10;&#10;Содержимое, созданное искусственным интеллектом, может быть неверным."/>
+                    <pic:cNvPicPr/>
+                  </pic:nvPicPr>
+                  <pic:blipFill>
+                    <a:blip r:embed="rId35"/>
+                    <a:stretch>
+                      <a:fillRect/>
+                    </a:stretch>
+                  </pic:blipFill>
+                  <pic:spPr>
+                    <a:xfrm>
+                      <a:off x="0" y="0"/>
+                      <a:ext cx="5493915" cy="2999760"/>
+                    </a:xfrm>
+                    <a:prstGeom prst="rect">
+                      <a:avLst/>
+                    </a:prstGeom>
+                  </pic:spPr>
+                </pic:pic>
+              </a:graphicData>
+            </a:graphic>
+          </wp:inline>
+        </w:drawing>
+      </w:r>
+    </w:p>
+    <w:p>
+      <w:pPr>
+        <w:pStyle w:val="1"/>
+        <w:jc w:val="center"/>
+        <w:rPr>
+          <w:noProof/>
+        </w:rPr>
+      </w:pPr>
+      <w:bookmarkStart w:id="11" w:name="_Toc203487719"/>
+      <w:r>
+        <w:rPr>
+          <w:noProof/>
         </w:rPr>
         <w:t>Зберегти графік</w:t>
+      </w:r>
+      <w:bookmarkEnd w:id="11"/>
+    </w:p>
+    <w:p>
+      <w:pPr>
+        <w:jc w:val="center"/>
+      </w:pPr>
+      <w:r>
+        <w:rPr>
+          <w:noProof/>
+        </w:rPr>
+        <w:drawing>
+          <wp:inline distT="0" distB="0" distL="0" distR="0" wp14:anchorId="24FDDF68" wp14:editId="1E0A0426">
+            <wp:extent cx="4470327" cy="3157870"/>
+            <wp:effectExtent l="0" t="0" r="6985" b="4445"/>
+            <wp:docPr id="1717071145" name="Рисунок 1" descr="Изображение выглядит как текст, снимок экрана, число, дисплей&#10;&#10;Содержимое, созданное искусственным интеллектом, может быть неверным."/>
+            <wp:cNvGraphicFramePr>
+              <a:graphicFrameLocks xmlns:a="http://schemas.openxmlformats.org/drawingml/2006/main" noChangeAspect="1"/>
+            </wp:cNvGraphicFramePr>
+            <a:graphic xmlns:a="http://schemas.openxmlformats.org/drawingml/2006/main">
+              <a:graphicData uri="http://schemas.openxmlformats.org/drawingml/2006/picture">
+                <pic:pic xmlns:pic="http://schemas.openxmlformats.org/drawingml/2006/picture">
+                  <pic:nvPicPr>
+                    <pic:cNvPr id="1717071145" name="Рисунок 1" descr="Изображение выглядит как текст, снимок экрана, число, дисплей&#10;&#10;Содержимое, созданное искусственным интеллектом, может быть неверным."/>
+                    <pic:cNvPicPr/>
+                  </pic:nvPicPr>
+                  <pic:blipFill>
+                    <a:blip r:embed="rId36"/>
+                    <a:stretch>
+                      <a:fillRect/>
+                    </a:stretch>
+                  </pic:blipFill>
+                  <pic:spPr>
+                    <a:xfrm>
+                      <a:off x="0" y="0"/>
+                      <a:ext cx="4478837" cy="3163882"/>
+                    </a:xfrm>
+                    <a:prstGeom prst="rect">
+                      <a:avLst/>
+                    </a:prstGeom>
+                  </pic:spPr>
+                </pic:pic>
+              </a:graphicData>
+            </a:graphic>
+          </wp:inline>
+        </w:drawing>
+      </w:r>
+      <w:r>
+        <w:rPr>
+          <w:noProof/>
+        </w:rPr>
+        <w:drawing>
+          <wp:inline distT="0" distB="0" distL="0" distR="0" wp14:anchorId="5953461B" wp14:editId="78233DB5">
+            <wp:extent cx="4132288" cy="2913321"/>
+            <wp:effectExtent l="0" t="0" r="1905" b="1905"/>
+            <wp:docPr id="1518530278" name="Рисунок 5"/>
+            <wp:cNvGraphicFramePr>
+              <a:graphicFrameLocks xmlns:a="http://schemas.openxmlformats.org/drawingml/2006/main" noChangeAspect="1"/>
+            </wp:cNvGraphicFramePr>
+            <a:graphic xmlns:a="http://schemas.openxmlformats.org/drawingml/2006/main">
+              <a:graphicData uri="http://schemas.openxmlformats.org/drawingml/2006/picture">
+                <pic:pic xmlns:pic="http://schemas.openxmlformats.org/drawingml/2006/picture">
+                  <pic:nvPicPr>
+                    <pic:cNvPr id="0" name="Picture 5"/>
+                    <pic:cNvPicPr>
+                      <a:picLocks noChangeAspect="1" noChangeArrowheads="1"/>
+                    </pic:cNvPicPr>
+                  </pic:nvPicPr>
+                  <pic:blipFill>
+                    <a:blip r:embed="rId37">
+                      <a:extLst>
+                        <a:ext uri="{28A0092B-C50C-407E-A947-70E740481C1C}">
+                          <a14:useLocalDpi xmlns:a14="http://schemas.microsoft.com/office/drawing/2010/main" val="0"/>
+                        </a:ext>
+                      </a:extLst>
+                    </a:blip>
+                    <a:srcRect/>
+                    <a:stretch>
+                      <a:fillRect/>
+                    </a:stretch>
+                  </pic:blipFill>
+                  <pic:spPr bwMode="auto">
+                    <a:xfrm>
+                      <a:off x="0" y="0"/>
+                      <a:ext cx="4191093" cy="2954779"/>
+                    </a:xfrm>
+                    <a:prstGeom prst="rect">
+                      <a:avLst/>
+                    </a:prstGeom>
+                    <a:noFill/>
+                    <a:ln>
+                      <a:noFill/>
+                    </a:ln>
+                  </pic:spPr>
+                </pic:pic>
+              </a:graphicData>
+            </a:graphic>
+          </wp:inline>
+        </w:drawing>
       </w:r>
     </w:p>
     <w:sectPr>
       <w:pgSz w:w="11920" w:h="16840"/>
-      <w:pgMar w:top="1360" w:right="1417" w:bottom="280" w:left="1417" w:header="708" w:footer="708" w:gutter="0"/>
+      <w:pgMar w:top="567" w:right="1418" w:bottom="567" w:left="1418" w:header="709" w:footer="709" w:gutter="0"/>
       <w:cols w:space="720"/>
+      <w:docGrid w:linePitch="299"/>
     </w:sectPr>
   </w:body>
 </w:document>
+</file>
+
+<file path=word/endnotes.xml><?xml version="1.0" encoding="utf-8"?>
+<w:endnotes xmlns:wpc="http://schemas.microsoft.com/office/word/2010/wordprocessingCanvas" xmlns:cx="http://schemas.microsoft.com/office/drawing/2014/chartex" xmlns:cx1="http://schemas.microsoft.com/office/drawing/2015/9/8/chartex" xmlns:cx2="http://schemas.microsoft.com/office/drawing/2015/10/21/chartex" xmlns:cx3="http://schemas.microsoft.com/office/drawing/2016/5/9/chartex" xmlns:cx4="http://schemas.microsoft.com/office/drawing/2016/5/10/chartex" xmlns:cx5="http://schemas.microsoft.com/office/drawing/2016/5/11/chartex" xmlns:cx6="http://schemas.microsoft.com/office/drawing/2016/5/12/chartex" xmlns:cx7="http://schemas.microsoft.com/office/drawing/2016/5/13/chartex" xmlns:cx8="http://schemas.microsoft.com/office/drawing/2016/5/14/chartex" xmlns:mc="http://schemas.openxmlformats.org/markup-compatibility/2006" xmlns:aink="http://schemas.microsoft.com/office/drawing/2016/ink" xmlns:am3d="http://schemas.microsoft.com/office/drawing/2017/model3d" xmlns:o="urn:schemas-microsoft-com:office:office" xmlns:oel="http://schemas.microsoft.com/office/2019/extlst" xmlns:r="http://schemas.openxmlformats.org/officeDocument/2006/relationships" xmlns:m="http://schemas.openxmlformats.org/officeDocument/2006/math" xmlns:v="urn:schemas-microsoft-com:vml" xmlns:wp14="http://schemas.microsoft.com/office/word/2010/wordprocessingDrawing" xmlns:wp="http://schemas.openxmlformats.org/drawingml/2006/wordprocessingDrawing" xmlns:w10="urn:schemas-microsoft-com:office:word" xmlns:w="http://schemas.openxmlformats.org/wordprocessingml/2006/main" xmlns:w14="http://schemas.microsoft.com/office/word/2010/wordml" xmlns:w15="http://schemas.microsoft.com/office/word/2012/wordml" xmlns:w16cex="http://schemas.microsoft.com/office/word/2018/wordml/cex" xmlns:w16cid="http://schemas.microsoft.com/office/word/2016/wordml/cid" xmlns:w16="http://schemas.microsoft.com/office/word/2018/wordml" xmlns:w16du="http://schemas.microsoft.com/office/word/2023/wordml/word16du" xmlns:w16sdtdh="http://schemas.microsoft.com/office/word/2020/wordml/sdtdatahash" xmlns:w16sdtfl="http://schemas.microsoft.com/office/word/2024/wordml/sdtformatlock" xmlns:w16se="http://schemas.microsoft.com/office/word/2015/wordml/symex" xmlns:wpg="http://schemas.microsoft.com/office/word/2010/wordprocessingGroup" xmlns:wpi="http://schemas.microsoft.com/office/word/2010/wordprocessingInk" xmlns:wne="http://schemas.microsoft.com/office/word/2006/wordml" xmlns:wps="http://schemas.microsoft.com/office/word/2010/wordprocessingShape" mc:Ignorable="w14 w15 w16se w16cid w16 w16cex w16sdtdh w16sdtfl w16du wp14">
+  <w:endnote w:type="separator" w:id="-1">
+    <w:p>
+      <w:r>
+        <w:separator/>
+      </w:r>
+    </w:p>
+  </w:endnote>
+  <w:endnote w:type="continuationSeparator" w:id="0">
+    <w:p>
+      <w:r>
+        <w:continuationSeparator/>
+      </w:r>
+    </w:p>
+  </w:endnote>
+</w:endnotes>
+</file>
+
+<file path=word/footnotes.xml><?xml version="1.0" encoding="utf-8"?>
+<w:footnotes xmlns:wpc="http://schemas.microsoft.com/office/word/2010/wordprocessingCanvas" xmlns:cx="http://schemas.microsoft.com/office/drawing/2014/chartex" xmlns:cx1="http://schemas.microsoft.com/office/drawing/2015/9/8/chartex" xmlns:cx2="http://schemas.microsoft.com/office/drawing/2015/10/21/chartex" xmlns:cx3="http://schemas.microsoft.com/office/drawing/2016/5/9/chartex" xmlns:cx4="http://schemas.microsoft.com/office/drawing/2016/5/10/chartex" xmlns:cx5="http://schemas.microsoft.com/office/drawing/2016/5/11/chartex" xmlns:cx6="http://schemas.microsoft.com/office/drawing/2016/5/12/chartex" xmlns:cx7="http://schemas.microsoft.com/office/drawing/2016/5/13/chartex" xmlns:cx8="http://schemas.microsoft.com/office/drawing/2016/5/14/chartex" xmlns:mc="http://schemas.openxmlformats.org/markup-compatibility/2006" xmlns:aink="http://schemas.microsoft.com/office/drawing/2016/ink" xmlns:am3d="http://schemas.microsoft.com/office/drawing/2017/model3d" xmlns:o="urn:schemas-microsoft-com:office:office" xmlns:oel="http://schemas.microsoft.com/office/2019/extlst" xmlns:r="http://schemas.openxmlformats.org/officeDocument/2006/relationships" xmlns:m="http://schemas.openxmlformats.org/officeDocument/2006/math" xmlns:v="urn:schemas-microsoft-com:vml" xmlns:wp14="http://schemas.microsoft.com/office/word/2010/wordprocessingDrawing" xmlns:wp="http://schemas.openxmlformats.org/drawingml/2006/wordprocessingDrawing" xmlns:w10="urn:schemas-microsoft-com:office:word" xmlns:w="http://schemas.openxmlformats.org/wordprocessingml/2006/main" xmlns:w14="http://schemas.microsoft.com/office/word/2010/wordml" xmlns:w15="http://schemas.microsoft.com/office/word/2012/wordml" xmlns:w16cex="http://schemas.microsoft.com/office/word/2018/wordml/cex" xmlns:w16cid="http://schemas.microsoft.com/office/word/2016/wordml/cid" xmlns:w16="http://schemas.microsoft.com/office/word/2018/wordml" xmlns:w16du="http://schemas.microsoft.com/office/word/2023/wordml/word16du" xmlns:w16sdtdh="http://schemas.microsoft.com/office/word/2020/wordml/sdtdatahash" xmlns:w16sdtfl="http://schemas.microsoft.com/office/word/2024/wordml/sdtformatlock" xmlns:w16se="http://schemas.microsoft.com/office/word/2015/wordml/symex" xmlns:wpg="http://schemas.microsoft.com/office/word/2010/wordprocessingGroup" xmlns:wpi="http://schemas.microsoft.com/office/word/2010/wordprocessingInk" xmlns:wne="http://schemas.microsoft.com/office/word/2006/wordml" xmlns:wps="http://schemas.microsoft.com/office/word/2010/wordprocessingShape" mc:Ignorable="w14 w15 w16se w16cid w16 w16cex w16sdtdh w16sdtfl w16du wp14">
+  <w:footnote w:type="separator" w:id="-1">
+    <w:p>
+      <w:r>
+        <w:separator/>
+      </w:r>
+    </w:p>
+  </w:footnote>
+  <w:footnote w:type="continuationSeparator" w:id="0">
+    <w:p>
+      <w:r>
+        <w:continuationSeparator/>
+      </w:r>
+    </w:p>
+  </w:footnote>
+</w:footnotes>
+</file>
+
+<file path=word/header1.xml><?xml version="1.0" encoding="utf-8"?>
+<w:hdr xmlns:wpc="http://schemas.microsoft.com/office/word/2010/wordprocessingCanvas" xmlns:cx="http://schemas.microsoft.com/office/drawing/2014/chartex" xmlns:cx1="http://schemas.microsoft.com/office/drawing/2015/9/8/chartex" xmlns:cx2="http://schemas.microsoft.com/office/drawing/2015/10/21/chartex" xmlns:cx3="http://schemas.microsoft.com/office/drawing/2016/5/9/chartex" xmlns:cx4="http://schemas.microsoft.com/office/drawing/2016/5/10/chartex" xmlns:cx5="http://schemas.microsoft.com/office/drawing/2016/5/11/chartex" xmlns:cx6="http://schemas.microsoft.com/office/drawing/2016/5/12/chartex" xmlns:cx7="http://schemas.microsoft.com/office/drawing/2016/5/13/chartex" xmlns:cx8="http://schemas.microsoft.com/office/drawing/2016/5/14/chartex" xmlns:mc="http://schemas.openxmlformats.org/markup-compatibility/2006" xmlns:aink="http://schemas.microsoft.com/office/drawing/2016/ink" xmlns:am3d="http://schemas.microsoft.com/office/drawing/2017/model3d" xmlns:o="urn:schemas-microsoft-com:office:office" xmlns:oel="http://schemas.microsoft.com/office/2019/extlst" xmlns:r="http://schemas.openxmlformats.org/officeDocument/2006/relationships" xmlns:m="http://schemas.openxmlformats.org/officeDocument/2006/math" xmlns:v="urn:schemas-microsoft-com:vml" xmlns:wp14="http://schemas.microsoft.com/office/word/2010/wordprocessingDrawing" xmlns:wp="http://schemas.openxmlformats.org/drawingml/2006/wordprocessingDrawing" xmlns:w10="urn:schemas-microsoft-com:office:word" xmlns:w="http://schemas.openxmlformats.org/wordprocessingml/2006/main" xmlns:w14="http://schemas.microsoft.com/office/word/2010/wordml" xmlns:w15="http://schemas.microsoft.com/office/word/2012/wordml" xmlns:w16cex="http://schemas.microsoft.com/office/word/2018/wordml/cex" xmlns:w16cid="http://schemas.microsoft.com/office/word/2016/wordml/cid" xmlns:w16="http://schemas.microsoft.com/office/word/2018/wordml" xmlns:w16du="http://schemas.microsoft.com/office/word/2023/wordml/word16du" xmlns:w16sdtdh="http://schemas.microsoft.com/office/word/2020/wordml/sdtdatahash" xmlns:w16sdtfl="http://schemas.microsoft.com/office/word/2024/wordml/sdtformatlock" xmlns:w16se="http://schemas.microsoft.com/office/word/2015/wordml/symex" xmlns:wpg="http://schemas.microsoft.com/office/word/2010/wordprocessingGroup" xmlns:wpi="http://schemas.microsoft.com/office/word/2010/wordprocessingInk" xmlns:wne="http://schemas.microsoft.com/office/word/2006/wordml" xmlns:wps="http://schemas.microsoft.com/office/word/2010/wordprocessingShape" mc:Ignorable="w14 w15 w16se w16cid w16 w16cex w16sdtdh w16sdtfl w16du wp14">
+  <w:sdt>
+    <w:sdtPr>
+      <w:id w:val="-913468621"/>
+      <w:docPartObj>
+        <w:docPartGallery w:val="Page Numbers (Top of Page)"/>
+        <w:docPartUnique/>
+      </w:docPartObj>
+    </w:sdtPr>
+    <w:sdtContent>
+      <w:p>
+        <w:pPr>
+          <w:pStyle w:val="ac"/>
+          <w:jc w:val="right"/>
+        </w:pPr>
+        <w:r>
+          <w:fldChar w:fldCharType="begin"/>
+        </w:r>
+        <w:r>
+          <w:instrText>PAGE   \* MERGEFORMAT</w:instrText>
+        </w:r>
+        <w:r>
+          <w:fldChar w:fldCharType="separate"/>
+        </w:r>
+        <w:r>
+          <w:rPr>
+            <w:lang w:val="ru-RU"/>
+          </w:rPr>
+          <w:t>2</w:t>
+        </w:r>
+        <w:r>
+          <w:fldChar w:fldCharType="end"/>
+        </w:r>
+      </w:p>
+    </w:sdtContent>
+  </w:sdt>
+  <w:p>
+    <w:pPr>
+      <w:pStyle w:val="ac"/>
+    </w:pPr>
+  </w:p>
+</w:hdr>
 </file>
 
 <file path=word/numbering.xml><?xml version="1.0" encoding="utf-8"?>
@@ -1173,11 +3730,100 @@
       </w:rPr>
     </w:lvl>
   </w:abstractNum>
+  <w:abstractNum w:abstractNumId="2" w15:restartNumberingAfterBreak="0">
+    <w:nsid w:val="6CAC4BC0"/>
+    <w:multiLevelType w:val="hybridMultilevel"/>
+    <w:tmpl w:val="A4EA5494"/>
+    <w:lvl w:ilvl="0" w:tplc="0419000F">
+      <w:start w:val="1"/>
+      <w:numFmt w:val="decimal"/>
+      <w:lvlText w:val="%1."/>
+      <w:lvlJc w:val="left"/>
+      <w:pPr>
+        <w:ind w:left="1146" w:hanging="360"/>
+      </w:pPr>
+    </w:lvl>
+    <w:lvl w:ilvl="1" w:tplc="04190019" w:tentative="1">
+      <w:start w:val="1"/>
+      <w:numFmt w:val="lowerLetter"/>
+      <w:lvlText w:val="%2."/>
+      <w:lvlJc w:val="left"/>
+      <w:pPr>
+        <w:ind w:left="1866" w:hanging="360"/>
+      </w:pPr>
+    </w:lvl>
+    <w:lvl w:ilvl="2" w:tplc="0419001B" w:tentative="1">
+      <w:start w:val="1"/>
+      <w:numFmt w:val="lowerRoman"/>
+      <w:lvlText w:val="%3."/>
+      <w:lvlJc w:val="right"/>
+      <w:pPr>
+        <w:ind w:left="2586" w:hanging="180"/>
+      </w:pPr>
+    </w:lvl>
+    <w:lvl w:ilvl="3" w:tplc="0419000F" w:tentative="1">
+      <w:start w:val="1"/>
+      <w:numFmt w:val="decimal"/>
+      <w:lvlText w:val="%4."/>
+      <w:lvlJc w:val="left"/>
+      <w:pPr>
+        <w:ind w:left="3306" w:hanging="360"/>
+      </w:pPr>
+    </w:lvl>
+    <w:lvl w:ilvl="4" w:tplc="04190019" w:tentative="1">
+      <w:start w:val="1"/>
+      <w:numFmt w:val="lowerLetter"/>
+      <w:lvlText w:val="%5."/>
+      <w:lvlJc w:val="left"/>
+      <w:pPr>
+        <w:ind w:left="4026" w:hanging="360"/>
+      </w:pPr>
+    </w:lvl>
+    <w:lvl w:ilvl="5" w:tplc="0419001B" w:tentative="1">
+      <w:start w:val="1"/>
+      <w:numFmt w:val="lowerRoman"/>
+      <w:lvlText w:val="%6."/>
+      <w:lvlJc w:val="right"/>
+      <w:pPr>
+        <w:ind w:left="4746" w:hanging="180"/>
+      </w:pPr>
+    </w:lvl>
+    <w:lvl w:ilvl="6" w:tplc="0419000F" w:tentative="1">
+      <w:start w:val="1"/>
+      <w:numFmt w:val="decimal"/>
+      <w:lvlText w:val="%7."/>
+      <w:lvlJc w:val="left"/>
+      <w:pPr>
+        <w:ind w:left="5466" w:hanging="360"/>
+      </w:pPr>
+    </w:lvl>
+    <w:lvl w:ilvl="7" w:tplc="04190019" w:tentative="1">
+      <w:start w:val="1"/>
+      <w:numFmt w:val="lowerLetter"/>
+      <w:lvlText w:val="%8."/>
+      <w:lvlJc w:val="left"/>
+      <w:pPr>
+        <w:ind w:left="6186" w:hanging="360"/>
+      </w:pPr>
+    </w:lvl>
+    <w:lvl w:ilvl="8" w:tplc="0419001B" w:tentative="1">
+      <w:start w:val="1"/>
+      <w:numFmt w:val="lowerRoman"/>
+      <w:lvlText w:val="%9."/>
+      <w:lvlJc w:val="right"/>
+      <w:pPr>
+        <w:ind w:left="6906" w:hanging="180"/>
+      </w:pPr>
+    </w:lvl>
+  </w:abstractNum>
   <w:num w:numId="1" w16cid:durableId="922372985">
     <w:abstractNumId w:val="1"/>
   </w:num>
   <w:num w:numId="2" w16cid:durableId="1367679781">
     <w:abstractNumId w:val="0"/>
+  </w:num>
+  <w:num w:numId="3" w16cid:durableId="261036626">
+    <w:abstractNumId w:val="2"/>
   </w:num>
 </w:numbering>
 </file>
@@ -1590,9 +4236,12 @@
   <w:style w:type="paragraph" w:styleId="1">
     <w:name w:val="heading 1"/>
     <w:basedOn w:val="a"/>
+    <w:next w:val="a"/>
     <w:uiPriority w:val="9"/>
     <w:qFormat/>
+    <w:rsid w:val="008B556D"/>
     <w:pPr>
+      <w:spacing w:before="240" w:line="360" w:lineRule="auto"/>
       <w:ind w:left="23"/>
       <w:outlineLvl w:val="0"/>
     </w:pPr>
@@ -1601,6 +4250,52 @@
       <w:bCs/>
       <w:sz w:val="28"/>
       <w:szCs w:val="28"/>
+    </w:rPr>
+  </w:style>
+  <w:style w:type="paragraph" w:styleId="2">
+    <w:name w:val="heading 2"/>
+    <w:basedOn w:val="a"/>
+    <w:next w:val="a"/>
+    <w:link w:val="20"/>
+    <w:uiPriority w:val="9"/>
+    <w:semiHidden/>
+    <w:unhideWhenUsed/>
+    <w:qFormat/>
+    <w:rsid w:val="00257A1B"/>
+    <w:pPr>
+      <w:keepNext/>
+      <w:keepLines/>
+      <w:spacing w:before="40"/>
+      <w:outlineLvl w:val="1"/>
+    </w:pPr>
+    <w:rPr>
+      <w:rFonts w:asciiTheme="majorHAnsi" w:eastAsiaTheme="majorEastAsia" w:hAnsiTheme="majorHAnsi" w:cstheme="majorBidi"/>
+      <w:color w:val="365F91" w:themeColor="accent1" w:themeShade="BF"/>
+      <w:sz w:val="26"/>
+      <w:szCs w:val="26"/>
+    </w:rPr>
+  </w:style>
+  <w:style w:type="paragraph" w:styleId="3">
+    <w:name w:val="heading 3"/>
+    <w:basedOn w:val="a"/>
+    <w:next w:val="a"/>
+    <w:link w:val="30"/>
+    <w:uiPriority w:val="9"/>
+    <w:semiHidden/>
+    <w:unhideWhenUsed/>
+    <w:qFormat/>
+    <w:rsid w:val="00257A1B"/>
+    <w:pPr>
+      <w:keepNext/>
+      <w:keepLines/>
+      <w:spacing w:before="40"/>
+      <w:outlineLvl w:val="2"/>
+    </w:pPr>
+    <w:rPr>
+      <w:rFonts w:asciiTheme="majorHAnsi" w:eastAsiaTheme="majorEastAsia" w:hAnsiTheme="majorHAnsi" w:cstheme="majorBidi"/>
+      <w:color w:val="243F60" w:themeColor="accent1" w:themeShade="7F"/>
+      <w:sz w:val="24"/>
+      <w:szCs w:val="24"/>
     </w:rPr>
   </w:style>
   <w:style w:type="character" w:default="1" w:styleId="a0">
@@ -1749,6 +4444,196 @@
         <w:insideV w:val="single" w:sz="4" w:space="0" w:color="auto"/>
       </w:tblBorders>
     </w:tblPr>
+  </w:style>
+  <w:style w:type="paragraph" w:styleId="a7">
+    <w:name w:val="Title"/>
+    <w:basedOn w:val="a"/>
+    <w:next w:val="a"/>
+    <w:link w:val="a8"/>
+    <w:uiPriority w:val="10"/>
+    <w:qFormat/>
+    <w:rsid w:val="00141F56"/>
+    <w:pPr>
+      <w:contextualSpacing/>
+    </w:pPr>
+    <w:rPr>
+      <w:rFonts w:asciiTheme="majorHAnsi" w:eastAsiaTheme="majorEastAsia" w:hAnsiTheme="majorHAnsi" w:cstheme="majorBidi"/>
+      <w:spacing w:val="-10"/>
+      <w:kern w:val="28"/>
+      <w:sz w:val="56"/>
+      <w:szCs w:val="56"/>
+    </w:rPr>
+  </w:style>
+  <w:style w:type="character" w:customStyle="1" w:styleId="a8">
+    <w:name w:val="Заголовок Знак"/>
+    <w:basedOn w:val="a0"/>
+    <w:link w:val="a7"/>
+    <w:uiPriority w:val="10"/>
+    <w:rsid w:val="00141F56"/>
+    <w:rPr>
+      <w:rFonts w:asciiTheme="majorHAnsi" w:eastAsiaTheme="majorEastAsia" w:hAnsiTheme="majorHAnsi" w:cstheme="majorBidi"/>
+      <w:spacing w:val="-10"/>
+      <w:kern w:val="28"/>
+      <w:sz w:val="56"/>
+      <w:szCs w:val="56"/>
+      <w:lang w:val="uk-UA"/>
+    </w:rPr>
+  </w:style>
+  <w:style w:type="character" w:styleId="a9">
+    <w:name w:val="Hyperlink"/>
+    <w:basedOn w:val="a0"/>
+    <w:uiPriority w:val="99"/>
+    <w:unhideWhenUsed/>
+    <w:rsid w:val="00141F56"/>
+    <w:rPr>
+      <w:color w:val="0000FF" w:themeColor="hyperlink"/>
+      <w:u w:val="single"/>
+    </w:rPr>
+  </w:style>
+  <w:style w:type="character" w:styleId="aa">
+    <w:name w:val="Unresolved Mention"/>
+    <w:basedOn w:val="a0"/>
+    <w:uiPriority w:val="99"/>
+    <w:semiHidden/>
+    <w:unhideWhenUsed/>
+    <w:rsid w:val="00141F56"/>
+    <w:rPr>
+      <w:color w:val="605E5C"/>
+      <w:shd w:val="clear" w:color="auto" w:fill="E1DFDD"/>
+    </w:rPr>
+  </w:style>
+  <w:style w:type="paragraph" w:styleId="ab">
+    <w:name w:val="TOC Heading"/>
+    <w:basedOn w:val="1"/>
+    <w:next w:val="a"/>
+    <w:uiPriority w:val="39"/>
+    <w:unhideWhenUsed/>
+    <w:qFormat/>
+    <w:rsid w:val="00257A1B"/>
+    <w:pPr>
+      <w:keepNext/>
+      <w:keepLines/>
+      <w:widowControl/>
+      <w:autoSpaceDE/>
+      <w:autoSpaceDN/>
+      <w:spacing w:line="259" w:lineRule="auto"/>
+      <w:ind w:left="0"/>
+      <w:outlineLvl w:val="9"/>
+    </w:pPr>
+    <w:rPr>
+      <w:rFonts w:asciiTheme="majorHAnsi" w:eastAsiaTheme="majorEastAsia" w:hAnsiTheme="majorHAnsi" w:cstheme="majorBidi"/>
+      <w:b w:val="0"/>
+      <w:bCs w:val="0"/>
+      <w:color w:val="365F91" w:themeColor="accent1" w:themeShade="BF"/>
+      <w:sz w:val="32"/>
+      <w:szCs w:val="32"/>
+      <w:lang w:val="ru-RU" w:eastAsia="ru-RU"/>
+    </w:rPr>
+  </w:style>
+  <w:style w:type="paragraph" w:styleId="10">
+    <w:name w:val="toc 1"/>
+    <w:basedOn w:val="a"/>
+    <w:next w:val="a"/>
+    <w:autoRedefine/>
+    <w:uiPriority w:val="39"/>
+    <w:unhideWhenUsed/>
+    <w:rsid w:val="00257A1B"/>
+    <w:pPr>
+      <w:spacing w:after="100"/>
+    </w:pPr>
+  </w:style>
+  <w:style w:type="character" w:customStyle="1" w:styleId="30">
+    <w:name w:val="Заголовок 3 Знак"/>
+    <w:basedOn w:val="a0"/>
+    <w:link w:val="3"/>
+    <w:uiPriority w:val="9"/>
+    <w:semiHidden/>
+    <w:rsid w:val="00257A1B"/>
+    <w:rPr>
+      <w:rFonts w:asciiTheme="majorHAnsi" w:eastAsiaTheme="majorEastAsia" w:hAnsiTheme="majorHAnsi" w:cstheme="majorBidi"/>
+      <w:color w:val="243F60" w:themeColor="accent1" w:themeShade="7F"/>
+      <w:sz w:val="24"/>
+      <w:szCs w:val="24"/>
+      <w:lang w:val="uk-UA"/>
+    </w:rPr>
+  </w:style>
+  <w:style w:type="character" w:customStyle="1" w:styleId="20">
+    <w:name w:val="Заголовок 2 Знак"/>
+    <w:basedOn w:val="a0"/>
+    <w:link w:val="2"/>
+    <w:uiPriority w:val="9"/>
+    <w:semiHidden/>
+    <w:rsid w:val="00257A1B"/>
+    <w:rPr>
+      <w:rFonts w:asciiTheme="majorHAnsi" w:eastAsiaTheme="majorEastAsia" w:hAnsiTheme="majorHAnsi" w:cstheme="majorBidi"/>
+      <w:color w:val="365F91" w:themeColor="accent1" w:themeShade="BF"/>
+      <w:sz w:val="26"/>
+      <w:szCs w:val="26"/>
+      <w:lang w:val="uk-UA"/>
+    </w:rPr>
+  </w:style>
+  <w:style w:type="paragraph" w:styleId="21">
+    <w:name w:val="toc 2"/>
+    <w:basedOn w:val="a"/>
+    <w:next w:val="a"/>
+    <w:autoRedefine/>
+    <w:uiPriority w:val="39"/>
+    <w:unhideWhenUsed/>
+    <w:rsid w:val="00257A1B"/>
+    <w:pPr>
+      <w:spacing w:after="100"/>
+      <w:ind w:left="220"/>
+    </w:pPr>
+  </w:style>
+  <w:style w:type="paragraph" w:styleId="ac">
+    <w:name w:val="header"/>
+    <w:basedOn w:val="a"/>
+    <w:link w:val="ad"/>
+    <w:uiPriority w:val="99"/>
+    <w:unhideWhenUsed/>
+    <w:rsid w:val="00202810"/>
+    <w:pPr>
+      <w:tabs>
+        <w:tab w:val="center" w:pos="4819"/>
+        <w:tab w:val="right" w:pos="9639"/>
+      </w:tabs>
+    </w:pPr>
+  </w:style>
+  <w:style w:type="character" w:customStyle="1" w:styleId="ad">
+    <w:name w:val="Верхний колонтитул Знак"/>
+    <w:basedOn w:val="a0"/>
+    <w:link w:val="ac"/>
+    <w:uiPriority w:val="99"/>
+    <w:rsid w:val="00202810"/>
+    <w:rPr>
+      <w:rFonts w:ascii="Times New Roman" w:eastAsia="Times New Roman" w:hAnsi="Times New Roman" w:cs="Times New Roman"/>
+      <w:lang w:val="uk-UA"/>
+    </w:rPr>
+  </w:style>
+  <w:style w:type="paragraph" w:styleId="ae">
+    <w:name w:val="footer"/>
+    <w:basedOn w:val="a"/>
+    <w:link w:val="af"/>
+    <w:uiPriority w:val="99"/>
+    <w:unhideWhenUsed/>
+    <w:rsid w:val="00202810"/>
+    <w:pPr>
+      <w:tabs>
+        <w:tab w:val="center" w:pos="4819"/>
+        <w:tab w:val="right" w:pos="9639"/>
+      </w:tabs>
+    </w:pPr>
+  </w:style>
+  <w:style w:type="character" w:customStyle="1" w:styleId="af">
+    <w:name w:val="Нижний колонтитул Знак"/>
+    <w:basedOn w:val="a0"/>
+    <w:link w:val="ae"/>
+    <w:uiPriority w:val="99"/>
+    <w:rsid w:val="00202810"/>
+    <w:rPr>
+      <w:rFonts w:ascii="Times New Roman" w:eastAsia="Times New Roman" w:hAnsi="Times New Roman" w:cs="Times New Roman"/>
+      <w:lang w:val="uk-UA"/>
+    </w:rPr>
   </w:style>
 </w:styles>
 </file>
@@ -2034,4 +4919,16 @@
   <a:objectDefaults/>
   <a:extraClrSchemeLst/>
 </a:theme>
+</file>
+
+<file path=customXml/item1.xml><?xml version="1.0" encoding="utf-8"?>
+<b:Sources xmlns:b="http://schemas.openxmlformats.org/officeDocument/2006/bibliography" xmlns="http://schemas.openxmlformats.org/officeDocument/2006/bibliography" SelectedStyle="\APASixthEditionOfficeOnline.xsl" StyleName="APA" Version="6"/>
+</file>
+
+<file path=customXml/itemProps1.xml><?xml version="1.0" encoding="utf-8"?>
+<ds:datastoreItem xmlns:ds="http://schemas.openxmlformats.org/officeDocument/2006/customXml" ds:itemID="{5CA660A7-4CBE-4B3C-8DF8-1DAD41F6FABA}">
+  <ds:schemaRefs>
+    <ds:schemaRef ds:uri="http://schemas.openxmlformats.org/officeDocument/2006/bibliography"/>
+  </ds:schemaRefs>
+</ds:datastoreItem>
 </file>
</xml_diff>